<commit_message>
Endpoint health, docu actualizada
</commit_message>
<xml_diff>
--- a/user-guide/Guía de instalación de PipelineMonitoring.docx
+++ b/user-guide/Guía de instalación de PipelineMonitoring.docx
@@ -34,6 +34,8 @@
         </w:rPr>
       </w:pPr>
       <w:bookmarkStart w:id="0" w:name="_p102h9nmwhf5" w:colFirst="0" w:colLast="0"/>
+      <w:bookmarkStart w:id="1" w:name="_Toc244245712"/>
+      <w:bookmarkStart w:id="2" w:name="_Toc244246144"/>
       <w:bookmarkEnd w:id="0"/>
       <w:proofErr w:type="spellStart"/>
       <w:r>
@@ -42,6 +44,8 @@
         </w:rPr>
         <w:t>Avvale</w:t>
       </w:r>
+      <w:bookmarkEnd w:id="1"/>
+      <w:bookmarkEnd w:id="2"/>
       <w:proofErr w:type="spellEnd"/>
     </w:p>
     <w:p>
@@ -51,8 +55,8 @@
           <w:lang w:val="es-ES"/>
         </w:rPr>
       </w:pPr>
-      <w:bookmarkStart w:id="1" w:name="_uat5uhtms0ep" w:colFirst="0" w:colLast="0"/>
-      <w:bookmarkEnd w:id="1"/>
+      <w:bookmarkStart w:id="3" w:name="_uat5uhtms0ep" w:colFirst="0" w:colLast="0"/>
+      <w:bookmarkEnd w:id="3"/>
       <w:r>
         <w:rPr>
           <w:lang w:val="es-ES"/>
@@ -90,20 +94,1237 @@
     </w:p>
     <w:p>
       <w:pPr>
+        <w:rPr>
+          <w:lang w:val="es-ES"/>
+        </w:rPr>
+      </w:pPr>
+      <w:bookmarkStart w:id="4" w:name="_6pu8yv5csaww" w:colFirst="0" w:colLast="0"/>
+      <w:bookmarkEnd w:id="4"/>
+    </w:p>
+    <w:bookmarkStart w:id="5" w:name="_Toc244246145" w:displacedByCustomXml="next"/>
+    <w:sdt>
+      <w:sdtPr>
+        <w:id w:val="422227589"/>
+        <w:docPartObj>
+          <w:docPartGallery w:val="Table of Contents"/>
+          <w:docPartUnique/>
+        </w:docPartObj>
+      </w:sdtPr>
+      <w:sdtEndPr>
+        <w:rPr>
+          <w:rFonts w:ascii="Archivo" w:eastAsia="Archivo" w:hAnsi="Archivo" w:cs="Archivo"/>
+          <w:b/>
+          <w:bCs/>
+          <w:color w:val="1E1E1E"/>
+          <w:sz w:val="20"/>
+          <w:szCs w:val="20"/>
+        </w:rPr>
+      </w:sdtEndPr>
+      <w:sdtContent>
+        <w:p>
+          <w:pPr>
+            <w:pStyle w:val="Ttulo1"/>
+          </w:pPr>
+          <w:r>
+            <w:t>Contenido</w:t>
+          </w:r>
+          <w:bookmarkEnd w:id="5"/>
+        </w:p>
+        <w:p>
+          <w:pPr>
+            <w:pStyle w:val="TDC1"/>
+            <w:rPr>
+              <w:rFonts w:asciiTheme="minorHAnsi" w:eastAsiaTheme="minorEastAsia" w:hAnsiTheme="minorHAnsi" w:cstheme="minorBidi"/>
+              <w:b w:val="0"/>
+              <w:bCs w:val="0"/>
+              <w:color w:val="auto"/>
+              <w:kern w:val="2"/>
+              <w:sz w:val="24"/>
+              <w:szCs w:val="24"/>
+              <w14:ligatures w14:val="standardContextual"/>
+            </w:rPr>
+          </w:pPr>
+          <w:r>
+            <w:fldChar w:fldCharType="begin"/>
+          </w:r>
+          <w:r>
+            <w:instrText xml:space="preserve"> TOC \o "1-3" \h \z \u </w:instrText>
+          </w:r>
+          <w:r>
+            <w:fldChar w:fldCharType="separate"/>
+          </w:r>
+          <w:hyperlink w:anchor="_Toc244246146" w:history="1">
+            <w:r>
+              <w:rPr>
+                <w:rStyle w:val="Hipervnculo"/>
+              </w:rPr>
+              <w:t>Versiones del documento</w:t>
+            </w:r>
+            <w:r>
+              <w:rPr>
+                <w:webHidden/>
+              </w:rPr>
+              <w:tab/>
+            </w:r>
+            <w:r>
+              <w:rPr>
+                <w:webHidden/>
+              </w:rPr>
+              <w:fldChar w:fldCharType="begin"/>
+            </w:r>
+            <w:r>
+              <w:rPr>
+                <w:webHidden/>
+              </w:rPr>
+              <w:instrText xml:space="preserve"> PAGEREF _Toc244246146 \h </w:instrText>
+            </w:r>
+            <w:r>
+              <w:rPr>
+                <w:webHidden/>
+              </w:rPr>
+            </w:r>
+            <w:r>
+              <w:rPr>
+                <w:webHidden/>
+              </w:rPr>
+              <w:fldChar w:fldCharType="separate"/>
+            </w:r>
+            <w:r>
+              <w:rPr>
+                <w:webHidden/>
+              </w:rPr>
+              <w:t>2</w:t>
+            </w:r>
+            <w:r>
+              <w:rPr>
+                <w:webHidden/>
+              </w:rPr>
+              <w:fldChar w:fldCharType="end"/>
+            </w:r>
+          </w:hyperlink>
+        </w:p>
+        <w:p>
+          <w:pPr>
+            <w:pStyle w:val="TDC1"/>
+            <w:rPr>
+              <w:rFonts w:asciiTheme="minorHAnsi" w:eastAsiaTheme="minorEastAsia" w:hAnsiTheme="minorHAnsi" w:cstheme="minorBidi"/>
+              <w:b w:val="0"/>
+              <w:bCs w:val="0"/>
+              <w:color w:val="auto"/>
+              <w:kern w:val="2"/>
+              <w:sz w:val="24"/>
+              <w:szCs w:val="24"/>
+              <w14:ligatures w14:val="standardContextual"/>
+            </w:rPr>
+          </w:pPr>
+          <w:hyperlink w:anchor="_Toc244246147" w:history="1">
+            <w:r>
+              <w:rPr>
+                <w:rStyle w:val="Hipervnculo"/>
+              </w:rPr>
+              <w:t>Introducción</w:t>
+            </w:r>
+            <w:r>
+              <w:rPr>
+                <w:webHidden/>
+              </w:rPr>
+              <w:tab/>
+            </w:r>
+            <w:r>
+              <w:rPr>
+                <w:webHidden/>
+              </w:rPr>
+              <w:fldChar w:fldCharType="begin"/>
+            </w:r>
+            <w:r>
+              <w:rPr>
+                <w:webHidden/>
+              </w:rPr>
+              <w:instrText xml:space="preserve"> PAGEREF _Toc244246147 \h </w:instrText>
+            </w:r>
+            <w:r>
+              <w:rPr>
+                <w:webHidden/>
+              </w:rPr>
+            </w:r>
+            <w:r>
+              <w:rPr>
+                <w:webHidden/>
+              </w:rPr>
+              <w:fldChar w:fldCharType="separate"/>
+            </w:r>
+            <w:r>
+              <w:rPr>
+                <w:webHidden/>
+              </w:rPr>
+              <w:t>3</w:t>
+            </w:r>
+            <w:r>
+              <w:rPr>
+                <w:webHidden/>
+              </w:rPr>
+              <w:fldChar w:fldCharType="end"/>
+            </w:r>
+          </w:hyperlink>
+        </w:p>
+        <w:p>
+          <w:pPr>
+            <w:pStyle w:val="TDC1"/>
+            <w:rPr>
+              <w:rFonts w:asciiTheme="minorHAnsi" w:eastAsiaTheme="minorEastAsia" w:hAnsiTheme="minorHAnsi" w:cstheme="minorBidi"/>
+              <w:b w:val="0"/>
+              <w:bCs w:val="0"/>
+              <w:color w:val="auto"/>
+              <w:kern w:val="2"/>
+              <w:sz w:val="24"/>
+              <w:szCs w:val="24"/>
+              <w14:ligatures w14:val="standardContextual"/>
+            </w:rPr>
+          </w:pPr>
+          <w:hyperlink w:anchor="_Toc244246148" w:history="1">
+            <w:r>
+              <w:rPr>
+                <w:rStyle w:val="Hipervnculo"/>
+              </w:rPr>
+              <w:t>Requisitos</w:t>
+            </w:r>
+            <w:r>
+              <w:rPr>
+                <w:webHidden/>
+              </w:rPr>
+              <w:tab/>
+            </w:r>
+            <w:r>
+              <w:rPr>
+                <w:webHidden/>
+              </w:rPr>
+              <w:fldChar w:fldCharType="begin"/>
+            </w:r>
+            <w:r>
+              <w:rPr>
+                <w:webHidden/>
+              </w:rPr>
+              <w:instrText xml:space="preserve"> PAGEREF _Toc244246148 \h </w:instrText>
+            </w:r>
+            <w:r>
+              <w:rPr>
+                <w:webHidden/>
+              </w:rPr>
+            </w:r>
+            <w:r>
+              <w:rPr>
+                <w:webHidden/>
+              </w:rPr>
+              <w:fldChar w:fldCharType="separate"/>
+            </w:r>
+            <w:r>
+              <w:rPr>
+                <w:webHidden/>
+              </w:rPr>
+              <w:t>4</w:t>
+            </w:r>
+            <w:r>
+              <w:rPr>
+                <w:webHidden/>
+              </w:rPr>
+              <w:fldChar w:fldCharType="end"/>
+            </w:r>
+          </w:hyperlink>
+        </w:p>
+        <w:p>
+          <w:pPr>
+            <w:pStyle w:val="TDC1"/>
+            <w:rPr>
+              <w:rFonts w:asciiTheme="minorHAnsi" w:eastAsiaTheme="minorEastAsia" w:hAnsiTheme="minorHAnsi" w:cstheme="minorBidi"/>
+              <w:b w:val="0"/>
+              <w:bCs w:val="0"/>
+              <w:color w:val="auto"/>
+              <w:kern w:val="2"/>
+              <w:sz w:val="24"/>
+              <w:szCs w:val="24"/>
+              <w14:ligatures w14:val="standardContextual"/>
+            </w:rPr>
+          </w:pPr>
+          <w:hyperlink w:anchor="_Toc244246149" w:history="1">
+            <w:r>
+              <w:rPr>
+                <w:rStyle w:val="Hipervnculo"/>
+              </w:rPr>
+              <w:t>Guía</w:t>
+            </w:r>
+            <w:r>
+              <w:rPr>
+                <w:webHidden/>
+              </w:rPr>
+              <w:tab/>
+            </w:r>
+            <w:r>
+              <w:rPr>
+                <w:webHidden/>
+              </w:rPr>
+              <w:fldChar w:fldCharType="begin"/>
+            </w:r>
+            <w:r>
+              <w:rPr>
+                <w:webHidden/>
+              </w:rPr>
+              <w:instrText xml:space="preserve"> PAGEREF _Toc244246149 \h </w:instrText>
+            </w:r>
+            <w:r>
+              <w:rPr>
+                <w:webHidden/>
+              </w:rPr>
+            </w:r>
+            <w:r>
+              <w:rPr>
+                <w:webHidden/>
+              </w:rPr>
+              <w:fldChar w:fldCharType="separate"/>
+            </w:r>
+            <w:r>
+              <w:rPr>
+                <w:webHidden/>
+              </w:rPr>
+              <w:t>5</w:t>
+            </w:r>
+            <w:r>
+              <w:rPr>
+                <w:webHidden/>
+              </w:rPr>
+              <w:fldChar w:fldCharType="end"/>
+            </w:r>
+          </w:hyperlink>
+        </w:p>
+        <w:p>
+          <w:pPr>
+            <w:pStyle w:val="TDC2"/>
+            <w:tabs>
+              <w:tab w:val="right" w:leader="dot" w:pos="9342"/>
+            </w:tabs>
+            <w:rPr>
+              <w:rFonts w:asciiTheme="minorHAnsi" w:eastAsiaTheme="minorEastAsia" w:hAnsiTheme="minorHAnsi" w:cstheme="minorBidi"/>
+              <w:noProof/>
+              <w:color w:val="auto"/>
+              <w:kern w:val="2"/>
+              <w:sz w:val="24"/>
+              <w:szCs w:val="24"/>
+              <w:highlight w:val="none"/>
+              <w:lang w:val="es-ES"/>
+              <w14:ligatures w14:val="standardContextual"/>
+            </w:rPr>
+          </w:pPr>
+          <w:hyperlink w:anchor="_Toc244246150" w:history="1">
+            <w:r>
+              <w:rPr>
+                <w:rStyle w:val="Hipervnculo"/>
+                <w:noProof/>
+                <w:lang w:val="es-ES"/>
+              </w:rPr>
+              <w:t>Configuración preliminar</w:t>
+            </w:r>
+            <w:r>
+              <w:rPr>
+                <w:noProof/>
+                <w:webHidden/>
+              </w:rPr>
+              <w:tab/>
+            </w:r>
+            <w:r>
+              <w:rPr>
+                <w:noProof/>
+                <w:webHidden/>
+              </w:rPr>
+              <w:fldChar w:fldCharType="begin"/>
+            </w:r>
+            <w:r>
+              <w:rPr>
+                <w:noProof/>
+                <w:webHidden/>
+              </w:rPr>
+              <w:instrText xml:space="preserve"> PAGEREF _Toc244246150 \h </w:instrText>
+            </w:r>
+            <w:r>
+              <w:rPr>
+                <w:noProof/>
+                <w:webHidden/>
+              </w:rPr>
+            </w:r>
+            <w:r>
+              <w:rPr>
+                <w:noProof/>
+                <w:webHidden/>
+              </w:rPr>
+              <w:fldChar w:fldCharType="separate"/>
+            </w:r>
+            <w:r>
+              <w:rPr>
+                <w:noProof/>
+                <w:webHidden/>
+              </w:rPr>
+              <w:t>5</w:t>
+            </w:r>
+            <w:r>
+              <w:rPr>
+                <w:noProof/>
+                <w:webHidden/>
+              </w:rPr>
+              <w:fldChar w:fldCharType="end"/>
+            </w:r>
+          </w:hyperlink>
+        </w:p>
+        <w:p>
+          <w:pPr>
+            <w:pStyle w:val="TDC2"/>
+            <w:tabs>
+              <w:tab w:val="right" w:leader="dot" w:pos="9342"/>
+            </w:tabs>
+            <w:rPr>
+              <w:rFonts w:asciiTheme="minorHAnsi" w:eastAsiaTheme="minorEastAsia" w:hAnsiTheme="minorHAnsi" w:cstheme="minorBidi"/>
+              <w:noProof/>
+              <w:color w:val="auto"/>
+              <w:kern w:val="2"/>
+              <w:sz w:val="24"/>
+              <w:szCs w:val="24"/>
+              <w:highlight w:val="none"/>
+              <w:lang w:val="es-ES"/>
+              <w14:ligatures w14:val="standardContextual"/>
+            </w:rPr>
+          </w:pPr>
+          <w:hyperlink w:anchor="_Toc244246151" w:history="1">
+            <w:r>
+              <w:rPr>
+                <w:rStyle w:val="Hipervnculo"/>
+                <w:noProof/>
+                <w:lang w:val="es-ES"/>
+              </w:rPr>
+              <w:t>Generación de service keys en SAP BTP</w:t>
+            </w:r>
+            <w:r>
+              <w:rPr>
+                <w:noProof/>
+                <w:webHidden/>
+              </w:rPr>
+              <w:tab/>
+            </w:r>
+            <w:r>
+              <w:rPr>
+                <w:noProof/>
+                <w:webHidden/>
+              </w:rPr>
+              <w:fldChar w:fldCharType="begin"/>
+            </w:r>
+            <w:r>
+              <w:rPr>
+                <w:noProof/>
+                <w:webHidden/>
+              </w:rPr>
+              <w:instrText xml:space="preserve"> PAGEREF _Toc244246151 \h </w:instrText>
+            </w:r>
+            <w:r>
+              <w:rPr>
+                <w:noProof/>
+                <w:webHidden/>
+              </w:rPr>
+            </w:r>
+            <w:r>
+              <w:rPr>
+                <w:noProof/>
+                <w:webHidden/>
+              </w:rPr>
+              <w:fldChar w:fldCharType="separate"/>
+            </w:r>
+            <w:r>
+              <w:rPr>
+                <w:noProof/>
+                <w:webHidden/>
+              </w:rPr>
+              <w:t>6</w:t>
+            </w:r>
+            <w:r>
+              <w:rPr>
+                <w:noProof/>
+                <w:webHidden/>
+              </w:rPr>
+              <w:fldChar w:fldCharType="end"/>
+            </w:r>
+          </w:hyperlink>
+        </w:p>
+        <w:p>
+          <w:pPr>
+            <w:pStyle w:val="TDC3"/>
+            <w:rPr>
+              <w:rFonts w:asciiTheme="minorHAnsi" w:eastAsiaTheme="minorEastAsia" w:hAnsiTheme="minorHAnsi" w:cstheme="minorBidi"/>
+              <w:color w:val="auto"/>
+              <w:kern w:val="2"/>
+              <w:sz w:val="24"/>
+              <w:szCs w:val="24"/>
+              <w14:ligatures w14:val="standardContextual"/>
+            </w:rPr>
+          </w:pPr>
+          <w:hyperlink w:anchor="_Toc244246152" w:history="1">
+            <w:r>
+              <w:rPr>
+                <w:rStyle w:val="Hipervnculo"/>
+              </w:rPr>
+              <w:t>Generación de service key para acceder a BTP</w:t>
+            </w:r>
+            <w:r>
+              <w:rPr>
+                <w:webHidden/>
+              </w:rPr>
+              <w:tab/>
+            </w:r>
+            <w:r>
+              <w:rPr>
+                <w:webHidden/>
+              </w:rPr>
+              <w:fldChar w:fldCharType="begin"/>
+            </w:r>
+            <w:r>
+              <w:rPr>
+                <w:webHidden/>
+              </w:rPr>
+              <w:instrText xml:space="preserve"> PAGEREF _Toc244246152 \h </w:instrText>
+            </w:r>
+            <w:r>
+              <w:rPr>
+                <w:webHidden/>
+              </w:rPr>
+            </w:r>
+            <w:r>
+              <w:rPr>
+                <w:webHidden/>
+              </w:rPr>
+              <w:fldChar w:fldCharType="separate"/>
+            </w:r>
+            <w:r>
+              <w:rPr>
+                <w:webHidden/>
+              </w:rPr>
+              <w:t>6</w:t>
+            </w:r>
+            <w:r>
+              <w:rPr>
+                <w:webHidden/>
+              </w:rPr>
+              <w:fldChar w:fldCharType="end"/>
+            </w:r>
+          </w:hyperlink>
+        </w:p>
+        <w:p>
+          <w:pPr>
+            <w:pStyle w:val="TDC3"/>
+            <w:rPr>
+              <w:rFonts w:asciiTheme="minorHAnsi" w:eastAsiaTheme="minorEastAsia" w:hAnsiTheme="minorHAnsi" w:cstheme="minorBidi"/>
+              <w:color w:val="auto"/>
+              <w:kern w:val="2"/>
+              <w:sz w:val="24"/>
+              <w:szCs w:val="24"/>
+              <w14:ligatures w14:val="standardContextual"/>
+            </w:rPr>
+          </w:pPr>
+          <w:hyperlink w:anchor="_Toc244246153" w:history="1">
+            <w:r>
+              <w:rPr>
+                <w:rStyle w:val="Hipervnculo"/>
+              </w:rPr>
+              <w:t>Generación de una service key para enviar notificaciones</w:t>
+            </w:r>
+            <w:r>
+              <w:rPr>
+                <w:webHidden/>
+              </w:rPr>
+              <w:tab/>
+            </w:r>
+            <w:r>
+              <w:rPr>
+                <w:webHidden/>
+              </w:rPr>
+              <w:fldChar w:fldCharType="begin"/>
+            </w:r>
+            <w:r>
+              <w:rPr>
+                <w:webHidden/>
+              </w:rPr>
+              <w:instrText xml:space="preserve"> PAGEREF _Toc244246153 \h </w:instrText>
+            </w:r>
+            <w:r>
+              <w:rPr>
+                <w:webHidden/>
+              </w:rPr>
+            </w:r>
+            <w:r>
+              <w:rPr>
+                <w:webHidden/>
+              </w:rPr>
+              <w:fldChar w:fldCharType="separate"/>
+            </w:r>
+            <w:r>
+              <w:rPr>
+                <w:webHidden/>
+              </w:rPr>
+              <w:t>9</w:t>
+            </w:r>
+            <w:r>
+              <w:rPr>
+                <w:webHidden/>
+              </w:rPr>
+              <w:fldChar w:fldCharType="end"/>
+            </w:r>
+          </w:hyperlink>
+        </w:p>
+        <w:p>
+          <w:pPr>
+            <w:pStyle w:val="TDC2"/>
+            <w:tabs>
+              <w:tab w:val="right" w:leader="dot" w:pos="9342"/>
+            </w:tabs>
+            <w:rPr>
+              <w:rFonts w:asciiTheme="minorHAnsi" w:eastAsiaTheme="minorEastAsia" w:hAnsiTheme="minorHAnsi" w:cstheme="minorBidi"/>
+              <w:noProof/>
+              <w:color w:val="auto"/>
+              <w:kern w:val="2"/>
+              <w:sz w:val="24"/>
+              <w:szCs w:val="24"/>
+              <w:highlight w:val="none"/>
+              <w:lang w:val="es-ES"/>
+              <w14:ligatures w14:val="standardContextual"/>
+            </w:rPr>
+          </w:pPr>
+          <w:hyperlink w:anchor="_Toc244246154" w:history="1">
+            <w:r>
+              <w:rPr>
+                <w:rStyle w:val="Hipervnculo"/>
+                <w:noProof/>
+                <w:lang w:val="es-ES"/>
+              </w:rPr>
+              <w:t>Configuración un endpoint para manejar alertas</w:t>
+            </w:r>
+            <w:r>
+              <w:rPr>
+                <w:noProof/>
+                <w:webHidden/>
+              </w:rPr>
+              <w:tab/>
+            </w:r>
+            <w:r>
+              <w:rPr>
+                <w:noProof/>
+                <w:webHidden/>
+              </w:rPr>
+              <w:fldChar w:fldCharType="begin"/>
+            </w:r>
+            <w:r>
+              <w:rPr>
+                <w:noProof/>
+                <w:webHidden/>
+              </w:rPr>
+              <w:instrText xml:space="preserve"> PAGEREF _Toc244246154 \h </w:instrText>
+            </w:r>
+            <w:r>
+              <w:rPr>
+                <w:noProof/>
+                <w:webHidden/>
+              </w:rPr>
+            </w:r>
+            <w:r>
+              <w:rPr>
+                <w:noProof/>
+                <w:webHidden/>
+              </w:rPr>
+              <w:fldChar w:fldCharType="separate"/>
+            </w:r>
+            <w:r>
+              <w:rPr>
+                <w:noProof/>
+                <w:webHidden/>
+              </w:rPr>
+              <w:t>10</w:t>
+            </w:r>
+            <w:r>
+              <w:rPr>
+                <w:noProof/>
+                <w:webHidden/>
+              </w:rPr>
+              <w:fldChar w:fldCharType="end"/>
+            </w:r>
+          </w:hyperlink>
+        </w:p>
+        <w:p>
+          <w:pPr>
+            <w:pStyle w:val="TDC2"/>
+            <w:tabs>
+              <w:tab w:val="right" w:leader="dot" w:pos="9342"/>
+            </w:tabs>
+            <w:rPr>
+              <w:rFonts w:asciiTheme="minorHAnsi" w:eastAsiaTheme="minorEastAsia" w:hAnsiTheme="minorHAnsi" w:cstheme="minorBidi"/>
+              <w:noProof/>
+              <w:color w:val="auto"/>
+              <w:kern w:val="2"/>
+              <w:sz w:val="24"/>
+              <w:szCs w:val="24"/>
+              <w:highlight w:val="none"/>
+              <w:lang w:val="es-ES"/>
+              <w14:ligatures w14:val="standardContextual"/>
+            </w:rPr>
+          </w:pPr>
+          <w:hyperlink w:anchor="_Toc244246155" w:history="1">
+            <w:r>
+              <w:rPr>
+                <w:rStyle w:val="Hipervnculo"/>
+                <w:noProof/>
+                <w:lang w:val="es-ES"/>
+              </w:rPr>
+              <w:t>Configuración de variables de entorno</w:t>
+            </w:r>
+            <w:r>
+              <w:rPr>
+                <w:noProof/>
+                <w:webHidden/>
+              </w:rPr>
+              <w:tab/>
+            </w:r>
+            <w:r>
+              <w:rPr>
+                <w:noProof/>
+                <w:webHidden/>
+              </w:rPr>
+              <w:fldChar w:fldCharType="begin"/>
+            </w:r>
+            <w:r>
+              <w:rPr>
+                <w:noProof/>
+                <w:webHidden/>
+              </w:rPr>
+              <w:instrText xml:space="preserve"> PAGEREF _Toc244246155 \h </w:instrText>
+            </w:r>
+            <w:r>
+              <w:rPr>
+                <w:noProof/>
+                <w:webHidden/>
+              </w:rPr>
+            </w:r>
+            <w:r>
+              <w:rPr>
+                <w:noProof/>
+                <w:webHidden/>
+              </w:rPr>
+              <w:fldChar w:fldCharType="separate"/>
+            </w:r>
+            <w:r>
+              <w:rPr>
+                <w:noProof/>
+                <w:webHidden/>
+              </w:rPr>
+              <w:t>13</w:t>
+            </w:r>
+            <w:r>
+              <w:rPr>
+                <w:noProof/>
+                <w:webHidden/>
+              </w:rPr>
+              <w:fldChar w:fldCharType="end"/>
+            </w:r>
+          </w:hyperlink>
+        </w:p>
+        <w:p>
+          <w:pPr>
+            <w:pStyle w:val="TDC2"/>
+            <w:tabs>
+              <w:tab w:val="right" w:leader="dot" w:pos="9342"/>
+            </w:tabs>
+            <w:rPr>
+              <w:rFonts w:asciiTheme="minorHAnsi" w:eastAsiaTheme="minorEastAsia" w:hAnsiTheme="minorHAnsi" w:cstheme="minorBidi"/>
+              <w:noProof/>
+              <w:color w:val="auto"/>
+              <w:kern w:val="2"/>
+              <w:sz w:val="24"/>
+              <w:szCs w:val="24"/>
+              <w:highlight w:val="none"/>
+              <w:lang w:val="es-ES"/>
+              <w14:ligatures w14:val="standardContextual"/>
+            </w:rPr>
+          </w:pPr>
+          <w:hyperlink w:anchor="_Toc244246156" w:history="1">
+            <w:r>
+              <w:rPr>
+                <w:rStyle w:val="Hipervnculo"/>
+                <w:noProof/>
+                <w:lang w:val="es-ES"/>
+              </w:rPr>
+              <w:t>Despliegue al entorno Cloud Foundry</w:t>
+            </w:r>
+            <w:r>
+              <w:rPr>
+                <w:noProof/>
+                <w:webHidden/>
+              </w:rPr>
+              <w:tab/>
+            </w:r>
+            <w:r>
+              <w:rPr>
+                <w:noProof/>
+                <w:webHidden/>
+              </w:rPr>
+              <w:fldChar w:fldCharType="begin"/>
+            </w:r>
+            <w:r>
+              <w:rPr>
+                <w:noProof/>
+                <w:webHidden/>
+              </w:rPr>
+              <w:instrText xml:space="preserve"> PAGEREF _Toc244246156 \h </w:instrText>
+            </w:r>
+            <w:r>
+              <w:rPr>
+                <w:noProof/>
+                <w:webHidden/>
+              </w:rPr>
+            </w:r>
+            <w:r>
+              <w:rPr>
+                <w:noProof/>
+                <w:webHidden/>
+              </w:rPr>
+              <w:fldChar w:fldCharType="separate"/>
+            </w:r>
+            <w:r>
+              <w:rPr>
+                <w:noProof/>
+                <w:webHidden/>
+              </w:rPr>
+              <w:t>14</w:t>
+            </w:r>
+            <w:r>
+              <w:rPr>
+                <w:noProof/>
+                <w:webHidden/>
+              </w:rPr>
+              <w:fldChar w:fldCharType="end"/>
+            </w:r>
+          </w:hyperlink>
+        </w:p>
+        <w:p>
+          <w:pPr>
+            <w:rPr>
+              <w:b/>
+              <w:bCs/>
+            </w:rPr>
+          </w:pPr>
+          <w:r>
+            <w:rPr>
+              <w:b/>
+              <w:bCs/>
+            </w:rPr>
+            <w:fldChar w:fldCharType="end"/>
+          </w:r>
+        </w:p>
+      </w:sdtContent>
+    </w:sdt>
+    <w:p>
+      <w:pPr>
         <w:pStyle w:val="Ttulo1"/>
-        <w:rPr>
-          <w:lang w:val="es-ES"/>
-        </w:rPr>
-      </w:pPr>
-      <w:bookmarkStart w:id="2" w:name="_6pu8yv5csaww" w:colFirst="0" w:colLast="0"/>
-      <w:bookmarkEnd w:id="2"/>
-      <w:r>
-        <w:rPr>
-          <w:lang w:val="es-ES"/>
-        </w:rPr>
-        <w:lastRenderedPageBreak/>
+      </w:pPr>
+      <w:bookmarkStart w:id="6" w:name="_Toc244246146"/>
+      <w:proofErr w:type="spellStart"/>
+      <w:r>
+        <w:t>Versiones</w:t>
+      </w:r>
+      <w:proofErr w:type="spellEnd"/>
+      <w:r>
+        <w:t xml:space="preserve"> del documento</w:t>
+      </w:r>
+      <w:bookmarkEnd w:id="6"/>
+    </w:p>
+    <w:tbl>
+      <w:tblPr>
+        <w:tblStyle w:val="Tablaconcuadrcula4-nfasis3"/>
+        <w:tblW w:w="0" w:type="auto"/>
+        <w:tblLook w:val="04A0" w:firstRow="1" w:lastRow="0" w:firstColumn="1" w:lastColumn="0" w:noHBand="0" w:noVBand="1"/>
+      </w:tblPr>
+      <w:tblGrid>
+        <w:gridCol w:w="1133"/>
+        <w:gridCol w:w="1414"/>
+        <w:gridCol w:w="2835"/>
+        <w:gridCol w:w="3960"/>
+      </w:tblGrid>
+      <w:tr>
+        <w:trPr>
+          <w:cnfStyle w:val="100000000000" w:firstRow="1" w:lastRow="0" w:firstColumn="0" w:lastColumn="0" w:oddVBand="0" w:evenVBand="0" w:oddHBand="0" w:evenHBand="0" w:firstRowFirstColumn="0" w:firstRowLastColumn="0" w:lastRowFirstColumn="0" w:lastRowLastColumn="0"/>
+        </w:trPr>
+        <w:tc>
+          <w:tcPr>
+            <w:cnfStyle w:val="001000000000" w:firstRow="0" w:lastRow="0" w:firstColumn="1" w:lastColumn="0" w:oddVBand="0" w:evenVBand="0" w:oddHBand="0" w:evenHBand="0" w:firstRowFirstColumn="0" w:firstRowLastColumn="0" w:lastRowFirstColumn="0" w:lastRowLastColumn="0"/>
+            <w:tcW w:w="1133" w:type="dxa"/>
+          </w:tcPr>
+          <w:p>
+            <w:pPr>
+              <w:jc w:val="center"/>
+              <w:rPr>
+                <w:color w:val="auto"/>
+                <w:highlight w:val="none"/>
+              </w:rPr>
+            </w:pPr>
+            <w:proofErr w:type="spellStart"/>
+            <w:r>
+              <w:rPr>
+                <w:color w:val="auto"/>
+                <w:highlight w:val="none"/>
+              </w:rPr>
+              <w:t>Versión</w:t>
+            </w:r>
+            <w:proofErr w:type="spellEnd"/>
+          </w:p>
+        </w:tc>
+        <w:tc>
+          <w:tcPr>
+            <w:tcW w:w="1414" w:type="dxa"/>
+          </w:tcPr>
+          <w:p>
+            <w:pPr>
+              <w:jc w:val="center"/>
+              <w:cnfStyle w:val="100000000000" w:firstRow="1" w:lastRow="0" w:firstColumn="0" w:lastColumn="0" w:oddVBand="0" w:evenVBand="0" w:oddHBand="0" w:evenHBand="0" w:firstRowFirstColumn="0" w:firstRowLastColumn="0" w:lastRowFirstColumn="0" w:lastRowLastColumn="0"/>
+              <w:rPr>
+                <w:color w:val="auto"/>
+                <w:highlight w:val="none"/>
+              </w:rPr>
+            </w:pPr>
+            <w:proofErr w:type="spellStart"/>
+            <w:r>
+              <w:rPr>
+                <w:color w:val="auto"/>
+                <w:highlight w:val="none"/>
+              </w:rPr>
+              <w:t>Fecha</w:t>
+            </w:r>
+            <w:proofErr w:type="spellEnd"/>
+          </w:p>
+        </w:tc>
+        <w:tc>
+          <w:tcPr>
+            <w:tcW w:w="2835" w:type="dxa"/>
+          </w:tcPr>
+          <w:p>
+            <w:pPr>
+              <w:jc w:val="center"/>
+              <w:cnfStyle w:val="100000000000" w:firstRow="1" w:lastRow="0" w:firstColumn="0" w:lastColumn="0" w:oddVBand="0" w:evenVBand="0" w:oddHBand="0" w:evenHBand="0" w:firstRowFirstColumn="0" w:firstRowLastColumn="0" w:lastRowFirstColumn="0" w:lastRowLastColumn="0"/>
+              <w:rPr>
+                <w:color w:val="auto"/>
+                <w:highlight w:val="none"/>
+              </w:rPr>
+            </w:pPr>
+            <w:r>
+              <w:rPr>
+                <w:color w:val="auto"/>
+                <w:highlight w:val="none"/>
+              </w:rPr>
+              <w:t>Autor</w:t>
+            </w:r>
+          </w:p>
+        </w:tc>
+        <w:tc>
+          <w:tcPr>
+            <w:tcW w:w="3960" w:type="dxa"/>
+          </w:tcPr>
+          <w:p>
+            <w:pPr>
+              <w:jc w:val="center"/>
+              <w:cnfStyle w:val="100000000000" w:firstRow="1" w:lastRow="0" w:firstColumn="0" w:lastColumn="0" w:oddVBand="0" w:evenVBand="0" w:oddHBand="0" w:evenHBand="0" w:firstRowFirstColumn="0" w:firstRowLastColumn="0" w:lastRowFirstColumn="0" w:lastRowLastColumn="0"/>
+              <w:rPr>
+                <w:color w:val="auto"/>
+                <w:highlight w:val="none"/>
+              </w:rPr>
+            </w:pPr>
+            <w:proofErr w:type="spellStart"/>
+            <w:r>
+              <w:rPr>
+                <w:color w:val="auto"/>
+                <w:highlight w:val="none"/>
+              </w:rPr>
+              <w:t>Comentario</w:t>
+            </w:r>
+            <w:proofErr w:type="spellEnd"/>
+          </w:p>
+        </w:tc>
+      </w:tr>
+      <w:tr>
+        <w:trPr>
+          <w:cnfStyle w:val="000000100000" w:firstRow="0" w:lastRow="0" w:firstColumn="0" w:lastColumn="0" w:oddVBand="0" w:evenVBand="0" w:oddHBand="1" w:evenHBand="0" w:firstRowFirstColumn="0" w:firstRowLastColumn="0" w:lastRowFirstColumn="0" w:lastRowLastColumn="0"/>
+        </w:trPr>
+        <w:tc>
+          <w:tcPr>
+            <w:cnfStyle w:val="001000000000" w:firstRow="0" w:lastRow="0" w:firstColumn="1" w:lastColumn="0" w:oddVBand="0" w:evenVBand="0" w:oddHBand="0" w:evenHBand="0" w:firstRowFirstColumn="0" w:firstRowLastColumn="0" w:lastRowFirstColumn="0" w:lastRowLastColumn="0"/>
+            <w:tcW w:w="1133" w:type="dxa"/>
+          </w:tcPr>
+          <w:p>
+            <w:pPr>
+              <w:jc w:val="center"/>
+              <w:rPr>
+                <w:highlight w:val="none"/>
+              </w:rPr>
+            </w:pPr>
+            <w:r>
+              <w:rPr>
+                <w:highlight w:val="none"/>
+              </w:rPr>
+              <w:t xml:space="preserve"> 1.0.0</w:t>
+            </w:r>
+          </w:p>
+        </w:tc>
+        <w:tc>
+          <w:tcPr>
+            <w:tcW w:w="1414" w:type="dxa"/>
+          </w:tcPr>
+          <w:p>
+            <w:pPr>
+              <w:jc w:val="center"/>
+              <w:cnfStyle w:val="000000100000" w:firstRow="0" w:lastRow="0" w:firstColumn="0" w:lastColumn="0" w:oddVBand="0" w:evenVBand="0" w:oddHBand="1" w:evenHBand="0" w:firstRowFirstColumn="0" w:firstRowLastColumn="0" w:lastRowFirstColumn="0" w:lastRowLastColumn="0"/>
+              <w:rPr>
+                <w:highlight w:val="none"/>
+              </w:rPr>
+            </w:pPr>
+            <w:r>
+              <w:rPr>
+                <w:highlight w:val="none"/>
+              </w:rPr>
+              <w:t>29/10/2026</w:t>
+            </w:r>
+          </w:p>
+        </w:tc>
+        <w:tc>
+          <w:tcPr>
+            <w:tcW w:w="2835" w:type="dxa"/>
+          </w:tcPr>
+          <w:p>
+            <w:pPr>
+              <w:jc w:val="center"/>
+              <w:cnfStyle w:val="000000100000" w:firstRow="0" w:lastRow="0" w:firstColumn="0" w:lastColumn="0" w:oddVBand="0" w:evenVBand="0" w:oddHBand="1" w:evenHBand="0" w:firstRowFirstColumn="0" w:firstRowLastColumn="0" w:lastRowFirstColumn="0" w:lastRowLastColumn="0"/>
+              <w:rPr>
+                <w:highlight w:val="none"/>
+              </w:rPr>
+            </w:pPr>
+            <w:r>
+              <w:rPr>
+                <w:highlight w:val="none"/>
+              </w:rPr>
+              <w:t>Manuel Almagro Rivas</w:t>
+            </w:r>
+          </w:p>
+        </w:tc>
+        <w:tc>
+          <w:tcPr>
+            <w:tcW w:w="3960" w:type="dxa"/>
+          </w:tcPr>
+          <w:p>
+            <w:pPr>
+              <w:jc w:val="center"/>
+              <w:cnfStyle w:val="000000100000" w:firstRow="0" w:lastRow="0" w:firstColumn="0" w:lastColumn="0" w:oddVBand="0" w:evenVBand="0" w:oddHBand="1" w:evenHBand="0" w:firstRowFirstColumn="0" w:firstRowLastColumn="0" w:lastRowFirstColumn="0" w:lastRowLastColumn="0"/>
+              <w:rPr>
+                <w:highlight w:val="none"/>
+              </w:rPr>
+            </w:pPr>
+            <w:proofErr w:type="spellStart"/>
+            <w:r>
+              <w:rPr>
+                <w:highlight w:val="none"/>
+              </w:rPr>
+              <w:t>Versión</w:t>
+            </w:r>
+            <w:proofErr w:type="spellEnd"/>
+            <w:r>
+              <w:rPr>
+                <w:highlight w:val="none"/>
+              </w:rPr>
+              <w:t xml:space="preserve"> </w:t>
+            </w:r>
+            <w:proofErr w:type="spellStart"/>
+            <w:r>
+              <w:rPr>
+                <w:highlight w:val="none"/>
+              </w:rPr>
+              <w:t>preliminar</w:t>
+            </w:r>
+            <w:proofErr w:type="spellEnd"/>
+          </w:p>
+        </w:tc>
+      </w:tr>
+      <w:tr>
+        <w:tc>
+          <w:tcPr>
+            <w:cnfStyle w:val="001000000000" w:firstRow="0" w:lastRow="0" w:firstColumn="1" w:lastColumn="0" w:oddVBand="0" w:evenVBand="0" w:oddHBand="0" w:evenHBand="0" w:firstRowFirstColumn="0" w:firstRowLastColumn="0" w:lastRowFirstColumn="0" w:lastRowLastColumn="0"/>
+            <w:tcW w:w="1133" w:type="dxa"/>
+          </w:tcPr>
+          <w:p>
+            <w:pPr>
+              <w:jc w:val="center"/>
+              <w:rPr>
+                <w:highlight w:val="none"/>
+              </w:rPr>
+            </w:pPr>
+            <w:r>
+              <w:rPr>
+                <w:highlight w:val="none"/>
+              </w:rPr>
+              <w:t>1.0.1</w:t>
+            </w:r>
+          </w:p>
+        </w:tc>
+        <w:tc>
+          <w:tcPr>
+            <w:tcW w:w="1414" w:type="dxa"/>
+          </w:tcPr>
+          <w:p>
+            <w:pPr>
+              <w:jc w:val="center"/>
+              <w:cnfStyle w:val="000000000000" w:firstRow="0" w:lastRow="0" w:firstColumn="0" w:lastColumn="0" w:oddVBand="0" w:evenVBand="0" w:oddHBand="0" w:evenHBand="0" w:firstRowFirstColumn="0" w:firstRowLastColumn="0" w:lastRowFirstColumn="0" w:lastRowLastColumn="0"/>
+              <w:rPr>
+                <w:highlight w:val="none"/>
+              </w:rPr>
+            </w:pPr>
+            <w:r>
+              <w:rPr>
+                <w:highlight w:val="none"/>
+              </w:rPr>
+              <w:t>30/10/2026</w:t>
+            </w:r>
+          </w:p>
+        </w:tc>
+        <w:tc>
+          <w:tcPr>
+            <w:tcW w:w="2835" w:type="dxa"/>
+          </w:tcPr>
+          <w:p>
+            <w:pPr>
+              <w:jc w:val="center"/>
+              <w:cnfStyle w:val="000000000000" w:firstRow="0" w:lastRow="0" w:firstColumn="0" w:lastColumn="0" w:oddVBand="0" w:evenVBand="0" w:oddHBand="0" w:evenHBand="0" w:firstRowFirstColumn="0" w:firstRowLastColumn="0" w:lastRowFirstColumn="0" w:lastRowLastColumn="0"/>
+              <w:rPr>
+                <w:highlight w:val="none"/>
+              </w:rPr>
+            </w:pPr>
+            <w:r>
+              <w:rPr>
+                <w:highlight w:val="none"/>
+              </w:rPr>
+              <w:t>Manuel Almagro Rivas</w:t>
+            </w:r>
+          </w:p>
+        </w:tc>
+        <w:tc>
+          <w:tcPr>
+            <w:tcW w:w="3960" w:type="dxa"/>
+          </w:tcPr>
+          <w:p>
+            <w:pPr>
+              <w:jc w:val="center"/>
+              <w:cnfStyle w:val="000000000000" w:firstRow="0" w:lastRow="0" w:firstColumn="0" w:lastColumn="0" w:oddVBand="0" w:evenVBand="0" w:oddHBand="0" w:evenHBand="0" w:firstRowFirstColumn="0" w:firstRowLastColumn="0" w:lastRowFirstColumn="0" w:lastRowLastColumn="0"/>
+              <w:rPr>
+                <w:highlight w:val="none"/>
+                <w:lang w:val="es-ES"/>
+              </w:rPr>
+            </w:pPr>
+            <w:proofErr w:type="spellStart"/>
+            <w:r>
+              <w:rPr>
+                <w:highlight w:val="none"/>
+                <w:lang w:val="es-ES"/>
+              </w:rPr>
+              <w:t>Binding</w:t>
+            </w:r>
+            <w:proofErr w:type="spellEnd"/>
+            <w:r>
+              <w:rPr>
+                <w:highlight w:val="none"/>
+                <w:lang w:val="es-ES"/>
+              </w:rPr>
+              <w:t xml:space="preserve"> de un host, nueva variable a informar</w:t>
+            </w:r>
+          </w:p>
+        </w:tc>
+      </w:tr>
+    </w:tbl>
+    <w:p>
+      <w:pPr>
+        <w:rPr>
+          <w:lang w:val="es-ES"/>
+        </w:rPr>
+      </w:pPr>
+    </w:p>
+    <w:p>
+      <w:pPr>
+        <w:rPr>
+          <w:b/>
+          <w:bCs/>
+          <w:lang w:val="es-ES"/>
+        </w:rPr>
+      </w:pPr>
+    </w:p>
+    <w:p>
+      <w:pPr>
+        <w:rPr>
+          <w:b/>
+          <w:bCs/>
+          <w:lang w:val="es-ES"/>
+        </w:rPr>
+      </w:pPr>
+    </w:p>
+    <w:p>
+      <w:pPr>
+        <w:rPr>
+          <w:b/>
+          <w:bCs/>
+          <w:lang w:val="es-ES"/>
+        </w:rPr>
+      </w:pPr>
+    </w:p>
+    <w:p>
+      <w:pPr>
+        <w:rPr>
+          <w:b/>
+          <w:bCs/>
+          <w:lang w:val="es-ES"/>
+        </w:rPr>
+      </w:pPr>
+    </w:p>
+    <w:p>
+      <w:pPr>
+        <w:rPr>
+          <w:b/>
+          <w:bCs/>
+          <w:lang w:val="es-ES"/>
+        </w:rPr>
+      </w:pPr>
+    </w:p>
+    <w:p>
+      <w:pPr>
+        <w:rPr>
+          <w:b/>
+          <w:bCs/>
+          <w:lang w:val="es-ES"/>
+        </w:rPr>
+      </w:pPr>
+    </w:p>
+    <w:p>
+      <w:pPr>
+        <w:rPr>
+          <w:lang w:val="es-ES"/>
+        </w:rPr>
+      </w:pPr>
+    </w:p>
+    <w:p>
+      <w:pPr>
+        <w:pStyle w:val="Ttulo1"/>
+        <w:rPr>
+          <w:lang w:val="es-ES"/>
+        </w:rPr>
+      </w:pPr>
+      <w:bookmarkStart w:id="7" w:name="_Toc244246147"/>
+      <w:r>
+        <w:rPr>
+          <w:lang w:val="es-ES"/>
+        </w:rPr>
         <w:t>Introducción</w:t>
       </w:r>
+      <w:bookmarkEnd w:id="7"/>
     </w:p>
     <w:p>
       <w:pPr>
@@ -331,7 +1552,7 @@
         </w:rPr>
         <w:t xml:space="preserve">Si se desea conocer cómo funciona la aplicación, la especificación (SPEC.md) puede encontrarse en el </w:t>
       </w:r>
-      <w:hyperlink r:id="rId7" w:history="1">
+      <w:hyperlink r:id="rId8" w:history="1">
         <w:r>
           <w:rPr>
             <w:rStyle w:val="Hipervnculo"/>
@@ -373,6 +1594,7 @@
           <w:lang w:val="es-ES"/>
         </w:rPr>
       </w:pPr>
+      <w:bookmarkStart w:id="8" w:name="_Toc244246148"/>
       <w:r>
         <w:rPr>
           <w:lang w:val="es-ES"/>
@@ -380,6 +1602,7 @@
         <w:lastRenderedPageBreak/>
         <w:t>Requisitos</w:t>
       </w:r>
+      <w:bookmarkEnd w:id="8"/>
     </w:p>
     <w:p>
       <w:pPr>
@@ -441,115 +1664,6 @@
           <w:lang w:val="es-ES"/>
         </w:rPr>
         <w:t xml:space="preserve">Tener instalado el cliente de línea de comandos de Cloud Foundry. </w:t>
-      </w:r>
-      <w:hyperlink r:id="rId8" w:history="1">
-        <w:r>
-          <w:rPr>
-            <w:rStyle w:val="Hipervnculo"/>
-            <w:lang w:val="es-ES"/>
-          </w:rPr>
-          <w:t>Enlace</w:t>
-        </w:r>
-      </w:hyperlink>
-      <w:r>
-        <w:rPr>
-          <w:lang w:val="es-ES"/>
-        </w:rPr>
-        <w:t>.</w:t>
-      </w:r>
-    </w:p>
-    <w:p>
-      <w:pPr>
-        <w:pStyle w:val="Prrafodelista"/>
-        <w:numPr>
-          <w:ilvl w:val="0"/>
-          <w:numId w:val="1"/>
-        </w:numPr>
-        <w:rPr>
-          <w:lang w:val="es-ES"/>
-        </w:rPr>
-      </w:pPr>
-      <w:r>
-        <w:rPr>
-          <w:lang w:val="es-ES"/>
-        </w:rPr>
-        <w:t xml:space="preserve">Disponer de </w:t>
-      </w:r>
-      <w:proofErr w:type="spellStart"/>
-      <w:r>
-        <w:rPr>
-          <w:rFonts w:ascii="Aptos Mono" w:hAnsi="Aptos Mono"/>
-          <w:lang w:val="es-ES"/>
-        </w:rPr>
-        <w:t>git</w:t>
-      </w:r>
-      <w:proofErr w:type="spellEnd"/>
-      <w:r>
-        <w:rPr>
-          <w:lang w:val="es-ES"/>
-        </w:rPr>
-        <w:t xml:space="preserve"> en línea de comandos.</w:t>
-      </w:r>
-    </w:p>
-    <w:p>
-      <w:pPr>
-        <w:pStyle w:val="Prrafodelista"/>
-        <w:numPr>
-          <w:ilvl w:val="1"/>
-          <w:numId w:val="1"/>
-        </w:numPr>
-        <w:rPr>
-          <w:lang w:val="es-ES"/>
-        </w:rPr>
-      </w:pPr>
-      <w:r>
-        <w:rPr>
-          <w:lang w:val="es-ES"/>
-        </w:rPr>
-        <w:t>En Windows, abrir una consola (Windows + R, cmd.exe) y escribir el comando “</w:t>
-      </w:r>
-      <w:proofErr w:type="spellStart"/>
-      <w:r>
-        <w:rPr>
-          <w:rFonts w:ascii="Aptos Mono" w:hAnsi="Aptos Mono"/>
-          <w:lang w:val="es-ES"/>
-        </w:rPr>
-        <w:t>git</w:t>
-      </w:r>
-      <w:proofErr w:type="spellEnd"/>
-      <w:r>
-        <w:rPr>
-          <w:rFonts w:ascii="Aptos Mono" w:hAnsi="Aptos Mono"/>
-          <w:lang w:val="es-ES"/>
-        </w:rPr>
-        <w:t xml:space="preserve"> </w:t>
-      </w:r>
-      <w:r>
-        <w:rPr>
-          <w:rFonts w:ascii="Aptos Mono" w:hAnsi="Aptos Mono"/>
-          <w:lang w:val="es-ES"/>
-        </w:rPr>
-        <w:t>-</w:t>
-      </w:r>
-      <w:r>
-        <w:rPr>
-          <w:rFonts w:ascii="Aptos Mono" w:hAnsi="Aptos Mono"/>
-          <w:lang w:val="es-ES"/>
-        </w:rPr>
-        <w:t>v</w:t>
-      </w:r>
-      <w:r>
-        <w:rPr>
-          <w:rFonts w:ascii="Aptos Mono" w:hAnsi="Aptos Mono"/>
-          <w:lang w:val="es-ES"/>
-        </w:rPr>
-        <w:t>”</w:t>
-      </w:r>
-      <w:r>
-        <w:rPr>
-          <w:lang w:val="es-ES"/>
-        </w:rPr>
-        <w:t xml:space="preserve">. Si nos aparece la versión, está instalado. Si no, hay que instalarlo. </w:t>
       </w:r>
       <w:hyperlink r:id="rId9" w:history="1">
         <w:r>
@@ -564,7 +1678,40 @@
         <w:rPr>
           <w:lang w:val="es-ES"/>
         </w:rPr>
-        <w:t xml:space="preserve">. </w:t>
+        <w:t>.</w:t>
+      </w:r>
+    </w:p>
+    <w:p>
+      <w:pPr>
+        <w:pStyle w:val="Prrafodelista"/>
+        <w:numPr>
+          <w:ilvl w:val="0"/>
+          <w:numId w:val="1"/>
+        </w:numPr>
+        <w:rPr>
+          <w:lang w:val="es-ES"/>
+        </w:rPr>
+      </w:pPr>
+      <w:r>
+        <w:rPr>
+          <w:lang w:val="es-ES"/>
+        </w:rPr>
+        <w:t xml:space="preserve">Disponer de </w:t>
+      </w:r>
+      <w:proofErr w:type="spellStart"/>
+      <w:r>
+        <w:rPr>
+          <w:rFonts w:ascii="Aptos Mono" w:hAnsi="Aptos Mono"/>
+          <w:lang w:val="es-ES"/>
+        </w:rPr>
+        <w:t>git</w:t>
+      </w:r>
+      <w:proofErr w:type="spellEnd"/>
+      <w:r>
+        <w:rPr>
+          <w:lang w:val="es-ES"/>
+        </w:rPr>
+        <w:t xml:space="preserve"> en línea de comandos.</w:t>
       </w:r>
     </w:p>
     <w:p>
@@ -582,7 +1729,50 @@
         <w:rPr>
           <w:lang w:val="es-ES"/>
         </w:rPr>
-        <w:t xml:space="preserve">En macOS está instalado de serie normalmente. Si no lo está, puede instalarse de diversas formas. </w:t>
+        <w:t>En Windows, abrir una consola (Windows + R, cmd.exe) y escribir el comando “</w:t>
+      </w:r>
+      <w:proofErr w:type="spellStart"/>
+      <w:r>
+        <w:rPr>
+          <w:rFonts w:ascii="Aptos Mono" w:hAnsi="Aptos Mono"/>
+          <w:lang w:val="es-ES"/>
+        </w:rPr>
+        <w:t>git</w:t>
+      </w:r>
+      <w:proofErr w:type="spellEnd"/>
+      <w:r>
+        <w:rPr>
+          <w:rFonts w:ascii="Aptos Mono" w:hAnsi="Aptos Mono"/>
+          <w:lang w:val="es-ES"/>
+        </w:rPr>
+        <w:t xml:space="preserve"> </w:t>
+      </w:r>
+      <w:r>
+        <w:rPr>
+          <w:rFonts w:ascii="Aptos Mono" w:hAnsi="Aptos Mono"/>
+          <w:lang w:val="es-ES"/>
+        </w:rPr>
+        <w:t>-</w:t>
+      </w:r>
+      <w:r>
+        <w:rPr>
+          <w:rFonts w:ascii="Aptos Mono" w:hAnsi="Aptos Mono"/>
+          <w:lang w:val="es-ES"/>
+        </w:rPr>
+        <w:t>v</w:t>
+      </w:r>
+      <w:r>
+        <w:rPr>
+          <w:rFonts w:ascii="Aptos Mono" w:hAnsi="Aptos Mono"/>
+          <w:lang w:val="es-ES"/>
+        </w:rPr>
+        <w:t>”</w:t>
+      </w:r>
+      <w:r>
+        <w:rPr>
+          <w:lang w:val="es-ES"/>
+        </w:rPr>
+        <w:t xml:space="preserve">. Si nos aparece la versión, está instalado. Si no, hay que instalarlo. </w:t>
       </w:r>
       <w:hyperlink r:id="rId10" w:history="1">
         <w:r>
@@ -597,28 +1787,15 @@
         <w:rPr>
           <w:lang w:val="es-ES"/>
         </w:rPr>
-        <w:t>.</w:t>
-      </w:r>
-    </w:p>
-    <w:p>
-      <w:pPr>
-        <w:rPr>
-          <w:lang w:val="es-ES"/>
-        </w:rPr>
-      </w:pPr>
-      <w:r>
-        <w:rPr>
-          <w:lang w:val="es-ES"/>
-        </w:rPr>
-        <w:t>En SAP BTP:</w:t>
+        <w:t xml:space="preserve">. </w:t>
       </w:r>
     </w:p>
     <w:p>
       <w:pPr>
         <w:pStyle w:val="Prrafodelista"/>
         <w:numPr>
-          <w:ilvl w:val="0"/>
-          <w:numId w:val="2"/>
+          <w:ilvl w:val="1"/>
+          <w:numId w:val="1"/>
         </w:numPr>
         <w:rPr>
           <w:lang w:val="es-ES"/>
@@ -628,49 +1805,7 @@
         <w:rPr>
           <w:lang w:val="es-ES"/>
         </w:rPr>
-        <w:t xml:space="preserve">Es necesario que el usuario con el que accedemos a la global </w:t>
-      </w:r>
-      <w:proofErr w:type="spellStart"/>
-      <w:r>
-        <w:rPr>
-          <w:lang w:val="es-ES"/>
-        </w:rPr>
-        <w:t>account</w:t>
-      </w:r>
-      <w:proofErr w:type="spellEnd"/>
-      <w:r>
-        <w:rPr>
-          <w:lang w:val="es-ES"/>
-        </w:rPr>
-        <w:t xml:space="preserve"> de BTP de nuestro cliente pertenezca al espacio </w:t>
-      </w:r>
-      <w:proofErr w:type="spellStart"/>
-      <w:r>
-        <w:rPr>
-          <w:lang w:val="es-ES"/>
-        </w:rPr>
-        <w:t>CloudFoundry</w:t>
-      </w:r>
-      <w:proofErr w:type="spellEnd"/>
-      <w:r>
-        <w:rPr>
-          <w:lang w:val="es-ES"/>
-        </w:rPr>
-        <w:t xml:space="preserve"> como </w:t>
-      </w:r>
-      <w:proofErr w:type="spellStart"/>
-      <w:r>
-        <w:rPr>
-          <w:lang w:val="es-ES"/>
-        </w:rPr>
-        <w:t>Developer</w:t>
-      </w:r>
-      <w:proofErr w:type="spellEnd"/>
-      <w:r>
-        <w:rPr>
-          <w:lang w:val="es-ES"/>
-        </w:rPr>
-        <w:t xml:space="preserve"> y/o Manager (</w:t>
+        <w:t xml:space="preserve">En macOS está instalado de serie normalmente. Si no lo está, puede instalarse de diversas formas. </w:t>
       </w:r>
       <w:hyperlink r:id="rId11" w:history="1">
         <w:r>
@@ -678,14 +1813,87 @@
             <w:rStyle w:val="Hipervnculo"/>
             <w:lang w:val="es-ES"/>
           </w:rPr>
-          <w:t>enlace</w:t>
+          <w:t>Enlace</w:t>
         </w:r>
       </w:hyperlink>
       <w:r>
         <w:rPr>
           <w:lang w:val="es-ES"/>
         </w:rPr>
-        <w:t>) y que sea miembro de la organización como Manager (</w:t>
+        <w:t>.</w:t>
+      </w:r>
+    </w:p>
+    <w:p>
+      <w:pPr>
+        <w:rPr>
+          <w:lang w:val="es-ES"/>
+        </w:rPr>
+      </w:pPr>
+      <w:r>
+        <w:rPr>
+          <w:lang w:val="es-ES"/>
+        </w:rPr>
+        <w:t>En SAP BTP:</w:t>
+      </w:r>
+    </w:p>
+    <w:p>
+      <w:pPr>
+        <w:pStyle w:val="Prrafodelista"/>
+        <w:numPr>
+          <w:ilvl w:val="0"/>
+          <w:numId w:val="2"/>
+        </w:numPr>
+        <w:rPr>
+          <w:lang w:val="es-ES"/>
+        </w:rPr>
+      </w:pPr>
+      <w:r>
+        <w:rPr>
+          <w:lang w:val="es-ES"/>
+        </w:rPr>
+        <w:t xml:space="preserve">Es necesario que el usuario con el que accedemos a la global </w:t>
+      </w:r>
+      <w:proofErr w:type="spellStart"/>
+      <w:r>
+        <w:rPr>
+          <w:lang w:val="es-ES"/>
+        </w:rPr>
+        <w:t>account</w:t>
+      </w:r>
+      <w:proofErr w:type="spellEnd"/>
+      <w:r>
+        <w:rPr>
+          <w:lang w:val="es-ES"/>
+        </w:rPr>
+        <w:t xml:space="preserve"> de BTP de nuestro cliente pertenezca al espacio </w:t>
+      </w:r>
+      <w:proofErr w:type="spellStart"/>
+      <w:r>
+        <w:rPr>
+          <w:lang w:val="es-ES"/>
+        </w:rPr>
+        <w:t>CloudFoundry</w:t>
+      </w:r>
+      <w:proofErr w:type="spellEnd"/>
+      <w:r>
+        <w:rPr>
+          <w:lang w:val="es-ES"/>
+        </w:rPr>
+        <w:t xml:space="preserve"> como </w:t>
+      </w:r>
+      <w:proofErr w:type="spellStart"/>
+      <w:r>
+        <w:rPr>
+          <w:lang w:val="es-ES"/>
+        </w:rPr>
+        <w:t>Developer</w:t>
+      </w:r>
+      <w:proofErr w:type="spellEnd"/>
+      <w:r>
+        <w:rPr>
+          <w:lang w:val="es-ES"/>
+        </w:rPr>
+        <w:t xml:space="preserve"> y/o Manager (</w:t>
       </w:r>
       <w:hyperlink r:id="rId12" w:history="1">
         <w:r>
@@ -700,6 +1908,21 @@
         <w:rPr>
           <w:lang w:val="es-ES"/>
         </w:rPr>
+        <w:t>) y que sea miembro de la organización como Manager (</w:t>
+      </w:r>
+      <w:hyperlink r:id="rId13" w:history="1">
+        <w:r>
+          <w:rPr>
+            <w:rStyle w:val="Hipervnculo"/>
+            <w:lang w:val="es-ES"/>
+          </w:rPr>
+          <w:t>enlace</w:t>
+        </w:r>
+      </w:hyperlink>
+      <w:r>
+        <w:rPr>
+          <w:lang w:val="es-ES"/>
+        </w:rPr>
         <w:t xml:space="preserve">). El objetivo es ser capaz de crear de manera autónoma dos </w:t>
       </w:r>
       <w:proofErr w:type="spellStart"/>
@@ -803,12 +2026,14 @@
           <w:lang w:val="es-ES"/>
         </w:rPr>
       </w:pPr>
+      <w:bookmarkStart w:id="9" w:name="_Toc244246149"/>
       <w:r>
         <w:rPr>
           <w:lang w:val="es-ES"/>
         </w:rPr>
         <w:t>Guía</w:t>
       </w:r>
+      <w:bookmarkEnd w:id="9"/>
       <w:r>
         <w:rPr>
           <w:lang w:val="es-ES"/>
@@ -823,12 +2048,14 @@
           <w:lang w:val="es-ES"/>
         </w:rPr>
       </w:pPr>
+      <w:bookmarkStart w:id="10" w:name="_Toc244246150"/>
       <w:r>
         <w:rPr>
           <w:lang w:val="es-ES"/>
         </w:rPr>
         <w:t>Configuración preliminar</w:t>
       </w:r>
+      <w:bookmarkEnd w:id="10"/>
     </w:p>
     <w:p>
       <w:pPr>
@@ -1129,14 +2356,7 @@
         <w:rPr>
           <w:lang w:val="es-ES"/>
         </w:rPr>
-        <w:t xml:space="preserve"> para que la información real que vive en este archivo nunca llegue a estar legible en ningún sitio delicado (GitHub, o el propio Cloud Foundry). Esto se configura respectivamente con los </w:t>
-      </w:r>
-      <w:proofErr w:type="gramStart"/>
-      <w:r>
-        <w:rPr>
-          <w:lang w:val="es-ES"/>
-        </w:rPr>
-        <w:t xml:space="preserve">archivos </w:t>
+        <w:t xml:space="preserve"> para que la información real que vive en este archivo nunca llegue a estar legible en ningún sitio delicado (GitHub, o el propio Cloud Foundry). Esto se configura respectivamente con los archivos </w:t>
       </w:r>
       <w:r>
         <w:rPr>
@@ -1154,19 +2374,11 @@
         <w:t>gitignore</w:t>
       </w:r>
       <w:proofErr w:type="spellEnd"/>
-      <w:proofErr w:type="gramEnd"/>
-      <w:r>
-        <w:rPr>
-          <w:lang w:val="es-ES"/>
-        </w:rPr>
-        <w:t xml:space="preserve"> </w:t>
-      </w:r>
-      <w:proofErr w:type="gramStart"/>
-      <w:r>
-        <w:rPr>
-          <w:lang w:val="es-ES"/>
-        </w:rPr>
-        <w:t xml:space="preserve">y </w:t>
+      <w:r>
+        <w:rPr>
+          <w:lang w:val="es-ES"/>
+        </w:rPr>
+        <w:t xml:space="preserve"> y </w:t>
       </w:r>
       <w:r>
         <w:rPr>
@@ -1184,7 +2396,6 @@
         <w:t>cfignore</w:t>
       </w:r>
       <w:proofErr w:type="spellEnd"/>
-      <w:proofErr w:type="gramEnd"/>
       <w:r>
         <w:rPr>
           <w:lang w:val="es-ES"/>
@@ -1359,7 +2570,14 @@
           <w:lang w:val="es-ES"/>
         </w:rPr>
         <w:lastRenderedPageBreak/>
-        <w:t xml:space="preserve"> Generación de </w:t>
+        <w:t xml:space="preserve"> </w:t>
+      </w:r>
+      <w:bookmarkStart w:id="11" w:name="_Toc244246151"/>
+      <w:r>
+        <w:rPr>
+          <w:lang w:val="es-ES"/>
+        </w:rPr>
+        <w:t xml:space="preserve">Generación de </w:t>
       </w:r>
       <w:proofErr w:type="spellStart"/>
       <w:r>
@@ -1389,6 +2607,7 @@
         </w:rPr>
         <w:t xml:space="preserve"> en SAP BTP</w:t>
       </w:r>
+      <w:bookmarkEnd w:id="11"/>
     </w:p>
     <w:p>
       <w:pPr>
@@ -1498,21 +2717,7 @@
         <w:rPr>
           <w:lang w:val="es-ES"/>
         </w:rPr>
-        <w:t xml:space="preserve">. generar un mail, abrir un </w:t>
-      </w:r>
-      <w:proofErr w:type="gramStart"/>
-      <w:r>
-        <w:rPr>
-          <w:lang w:val="es-ES"/>
-        </w:rPr>
-        <w:t>ticket</w:t>
-      </w:r>
-      <w:proofErr w:type="gramEnd"/>
-      <w:r>
-        <w:rPr>
-          <w:lang w:val="es-ES"/>
-        </w:rPr>
-        <w:t xml:space="preserve"> en alguna plataforma, depositar un fichero, etc.).</w:t>
+        <w:t>. generar un mail, abrir un ticket en alguna plataforma, depositar un fichero, etc.).</w:t>
       </w:r>
     </w:p>
     <w:p>
@@ -1522,6 +2727,7 @@
           <w:lang w:val="es-ES"/>
         </w:rPr>
       </w:pPr>
+      <w:bookmarkStart w:id="12" w:name="_Toc244246152"/>
       <w:r>
         <w:rPr>
           <w:lang w:val="es-ES"/>
@@ -1556,6 +2762,7 @@
         </w:rPr>
         <w:t xml:space="preserve"> para acceder a BTP</w:t>
       </w:r>
+      <w:bookmarkEnd w:id="12"/>
     </w:p>
     <w:p>
       <w:pPr>
@@ -1574,7 +2781,7 @@
         </w:rPr>
         <w:t xml:space="preserve">A través del </w:t>
       </w:r>
-      <w:hyperlink r:id="rId13" w:anchor="/" w:history="1">
+      <w:hyperlink r:id="rId14" w:anchor="/" w:history="1">
         <w:r>
           <w:rPr>
             <w:rStyle w:val="Hipervnculo"/>
@@ -1668,7 +2875,7 @@
                     <pic:cNvPicPr/>
                   </pic:nvPicPr>
                   <pic:blipFill>
-                    <a:blip r:embed="rId14"/>
+                    <a:blip r:embed="rId15"/>
                     <a:stretch>
                       <a:fillRect/>
                     </a:stretch>
@@ -1739,7 +2946,7 @@
                     <pic:cNvPicPr/>
                   </pic:nvPicPr>
                   <pic:blipFill>
-                    <a:blip r:embed="rId15"/>
+                    <a:blip r:embed="rId16"/>
                     <a:stretch>
                       <a:fillRect/>
                     </a:stretch>
@@ -1952,7 +3159,7 @@
                     <pic:cNvPicPr/>
                   </pic:nvPicPr>
                   <pic:blipFill>
-                    <a:blip r:embed="rId16"/>
+                    <a:blip r:embed="rId17"/>
                     <a:stretch>
                       <a:fillRect/>
                     </a:stretch>
@@ -2065,7 +3272,7 @@
                     <pic:cNvPicPr/>
                   </pic:nvPicPr>
                   <pic:blipFill>
-                    <a:blip r:embed="rId17"/>
+                    <a:blip r:embed="rId18"/>
                     <a:stretch>
                       <a:fillRect/>
                     </a:stretch>
@@ -2136,7 +3343,7 @@
                     <pic:cNvPicPr/>
                   </pic:nvPicPr>
                   <pic:blipFill>
-                    <a:blip r:embed="rId18"/>
+                    <a:blip r:embed="rId19"/>
                     <a:stretch>
                       <a:fillRect/>
                     </a:stretch>
@@ -2201,7 +3408,7 @@
                     <pic:cNvPicPr/>
                   </pic:nvPicPr>
                   <pic:blipFill>
-                    <a:blip r:embed="rId19"/>
+                    <a:blip r:embed="rId20"/>
                     <a:stretch>
                       <a:fillRect/>
                     </a:stretch>
@@ -2283,7 +3490,7 @@
                     <pic:cNvPicPr/>
                   </pic:nvPicPr>
                   <pic:blipFill>
-                    <a:blip r:embed="rId20"/>
+                    <a:blip r:embed="rId21"/>
                     <a:stretch>
                       <a:fillRect/>
                     </a:stretch>
@@ -2383,6 +3590,7 @@
           <w:lang w:val="es-ES"/>
         </w:rPr>
       </w:pPr>
+      <w:bookmarkStart w:id="13" w:name="_Toc244246153"/>
       <w:r>
         <w:rPr>
           <w:lang w:val="es-ES"/>
@@ -2418,6 +3626,7 @@
         </w:rPr>
         <w:t xml:space="preserve"> para enviar notificaciones</w:t>
       </w:r>
+      <w:bookmarkEnd w:id="13"/>
     </w:p>
     <w:p>
       <w:pPr>
@@ -2516,7 +3725,7 @@
                     <pic:cNvPicPr/>
                   </pic:nvPicPr>
                   <pic:blipFill>
-                    <a:blip r:embed="rId21"/>
+                    <a:blip r:embed="rId22"/>
                     <a:stretch>
                       <a:fillRect/>
                     </a:stretch>
@@ -2603,6 +3812,7 @@
         </w:rPr>
         <w:br w:type="page"/>
       </w:r>
+      <w:bookmarkStart w:id="14" w:name="_Toc244246154"/>
       <w:r>
         <w:rPr>
           <w:lang w:val="es-ES"/>
@@ -2624,6 +3834,7 @@
         </w:rPr>
         <w:t xml:space="preserve"> para manejar alertas</w:t>
       </w:r>
+      <w:bookmarkEnd w:id="14"/>
     </w:p>
     <w:p>
       <w:pPr>
@@ -2831,31 +4042,7 @@
                                 <w:highlight w:val="none"/>
                                 <w:lang w:val="fr-FR"/>
                               </w:rPr>
-                              <w:t xml:space="preserve">  "Client</w:t>
-                            </w:r>
-                            <w:proofErr w:type="gramStart"/>
-                            <w:r>
-                              <w:rPr>
-                                <w:rFonts w:ascii="Aptos Mono" w:hAnsi="Aptos Mono"/>
-                                <w:color w:val="000000" w:themeColor="text1"/>
-                                <w:sz w:val="16"/>
-                                <w:szCs w:val="16"/>
-                                <w:highlight w:val="none"/>
-                                <w:lang w:val="fr-FR"/>
-                              </w:rPr>
-                              <w:t>":</w:t>
-                            </w:r>
-                            <w:proofErr w:type="gramEnd"/>
-                            <w:r>
-                              <w:rPr>
-                                <w:rFonts w:ascii="Aptos Mono" w:hAnsi="Aptos Mono"/>
-                                <w:color w:val="000000" w:themeColor="text1"/>
-                                <w:sz w:val="16"/>
-                                <w:szCs w:val="16"/>
-                                <w:highlight w:val="none"/>
-                                <w:lang w:val="fr-FR"/>
-                              </w:rPr>
-                              <w:t xml:space="preserve"> "</w:t>
+                              <w:t xml:space="preserve">  "Client": "</w:t>
                             </w:r>
                             <w:proofErr w:type="spellStart"/>
                             <w:r>
@@ -2918,7 +4105,6 @@
                               <w:t>Environment</w:t>
                             </w:r>
                             <w:proofErr w:type="spellEnd"/>
-                            <w:proofErr w:type="gramStart"/>
                             <w:r>
                               <w:rPr>
                                 <w:rFonts w:ascii="Aptos Mono" w:hAnsi="Aptos Mono"/>
@@ -2928,19 +4114,7 @@
                                 <w:highlight w:val="none"/>
                                 <w:lang w:val="fr-FR"/>
                               </w:rPr>
-                              <w:t>":</w:t>
-                            </w:r>
-                            <w:proofErr w:type="gramEnd"/>
-                            <w:r>
-                              <w:rPr>
-                                <w:rFonts w:ascii="Aptos Mono" w:hAnsi="Aptos Mono"/>
-                                <w:color w:val="000000" w:themeColor="text1"/>
-                                <w:sz w:val="16"/>
-                                <w:szCs w:val="16"/>
-                                <w:highlight w:val="none"/>
-                                <w:lang w:val="fr-FR"/>
-                              </w:rPr>
-                              <w:t xml:space="preserve"> "dev",</w:t>
+                              <w:t>": "dev",</w:t>
                             </w:r>
                           </w:p>
                           <w:p>
@@ -2964,55 +4138,7 @@
                                 <w:highlight w:val="none"/>
                                 <w:lang w:val="fr-FR"/>
                               </w:rPr>
-                              <w:t xml:space="preserve">  "Timestamp</w:t>
-                            </w:r>
-                            <w:proofErr w:type="gramStart"/>
-                            <w:r>
-                              <w:rPr>
-                                <w:rFonts w:ascii="Aptos Mono" w:hAnsi="Aptos Mono"/>
-                                <w:color w:val="000000" w:themeColor="text1"/>
-                                <w:sz w:val="16"/>
-                                <w:szCs w:val="16"/>
-                                <w:highlight w:val="none"/>
-                                <w:lang w:val="fr-FR"/>
-                              </w:rPr>
-                              <w:t>":</w:t>
-                            </w:r>
-                            <w:proofErr w:type="gramEnd"/>
-                            <w:r>
-                              <w:rPr>
-                                <w:rFonts w:ascii="Aptos Mono" w:hAnsi="Aptos Mono"/>
-                                <w:color w:val="000000" w:themeColor="text1"/>
-                                <w:sz w:val="16"/>
-                                <w:szCs w:val="16"/>
-                                <w:highlight w:val="none"/>
-                                <w:lang w:val="fr-FR"/>
-                              </w:rPr>
-                              <w:t xml:space="preserve"> "2026-10-29T</w:t>
-                            </w:r>
-                            <w:proofErr w:type="gramStart"/>
-                            <w:r>
-                              <w:rPr>
-                                <w:rFonts w:ascii="Aptos Mono" w:hAnsi="Aptos Mono"/>
-                                <w:color w:val="000000" w:themeColor="text1"/>
-                                <w:sz w:val="16"/>
-                                <w:szCs w:val="16"/>
-                                <w:highlight w:val="none"/>
-                                <w:lang w:val="fr-FR"/>
-                              </w:rPr>
-                              <w:t>09:33:</w:t>
-                            </w:r>
-                            <w:proofErr w:type="gramEnd"/>
-                            <w:r>
-                              <w:rPr>
-                                <w:rFonts w:ascii="Aptos Mono" w:hAnsi="Aptos Mono"/>
-                                <w:color w:val="000000" w:themeColor="text1"/>
-                                <w:sz w:val="16"/>
-                                <w:szCs w:val="16"/>
-                                <w:highlight w:val="none"/>
-                                <w:lang w:val="fr-FR"/>
-                              </w:rPr>
-                              <w:t>20.692Z",</w:t>
+                              <w:t xml:space="preserve">  "Timestamp": "2026-10-29T09:33:20.692Z",</w:t>
                             </w:r>
                           </w:p>
                           <w:p>
@@ -3051,7 +4177,6 @@
                               <w:t>AffectedQueues</w:t>
                             </w:r>
                             <w:proofErr w:type="spellEnd"/>
-                            <w:proofErr w:type="gramStart"/>
                             <w:r>
                               <w:rPr>
                                 <w:rFonts w:ascii="Aptos Mono" w:hAnsi="Aptos Mono"/>
@@ -3061,19 +4186,7 @@
                                 <w:highlight w:val="none"/>
                                 <w:lang w:val="fr-FR"/>
                               </w:rPr>
-                              <w:t>":</w:t>
-                            </w:r>
-                            <w:proofErr w:type="gramEnd"/>
-                            <w:r>
-                              <w:rPr>
-                                <w:rFonts w:ascii="Aptos Mono" w:hAnsi="Aptos Mono"/>
-                                <w:color w:val="000000" w:themeColor="text1"/>
-                                <w:sz w:val="16"/>
-                                <w:szCs w:val="16"/>
-                                <w:highlight w:val="none"/>
-                                <w:lang w:val="fr-FR"/>
-                              </w:rPr>
-                              <w:t xml:space="preserve"> [</w:t>
+                              <w:t>": [</w:t>
                             </w:r>
                           </w:p>
                           <w:p>
@@ -3136,7 +4249,6 @@
                               <w:t>QueueName</w:t>
                             </w:r>
                             <w:proofErr w:type="spellEnd"/>
-                            <w:proofErr w:type="gramStart"/>
                             <w:r>
                               <w:rPr>
                                 <w:rFonts w:ascii="Aptos Mono" w:hAnsi="Aptos Mono"/>
@@ -3146,19 +4258,7 @@
                                 <w:highlight w:val="none"/>
                                 <w:lang w:val="fr-FR"/>
                               </w:rPr>
-                              <w:t>":</w:t>
-                            </w:r>
-                            <w:proofErr w:type="gramEnd"/>
-                            <w:r>
-                              <w:rPr>
-                                <w:rFonts w:ascii="Aptos Mono" w:hAnsi="Aptos Mono"/>
-                                <w:color w:val="000000" w:themeColor="text1"/>
-                                <w:sz w:val="16"/>
-                                <w:szCs w:val="16"/>
-                                <w:highlight w:val="none"/>
-                                <w:lang w:val="fr-FR"/>
-                              </w:rPr>
-                              <w:t xml:space="preserve"> "</w:t>
+                              <w:t>": "</w:t>
                             </w:r>
                             <w:proofErr w:type="spellStart"/>
                             <w:r>
@@ -3221,7 +4321,6 @@
                               <w:t>PreviousQueuedMessages</w:t>
                             </w:r>
                             <w:proofErr w:type="spellEnd"/>
-                            <w:proofErr w:type="gramStart"/>
                             <w:r>
                               <w:rPr>
                                 <w:rFonts w:ascii="Aptos Mono" w:hAnsi="Aptos Mono"/>
@@ -3231,19 +4330,7 @@
                                 <w:highlight w:val="none"/>
                                 <w:lang w:val="fr-FR"/>
                               </w:rPr>
-                              <w:t>":</w:t>
-                            </w:r>
-                            <w:proofErr w:type="gramEnd"/>
-                            <w:r>
-                              <w:rPr>
-                                <w:rFonts w:ascii="Aptos Mono" w:hAnsi="Aptos Mono"/>
-                                <w:color w:val="000000" w:themeColor="text1"/>
-                                <w:sz w:val="16"/>
-                                <w:szCs w:val="16"/>
-                                <w:highlight w:val="none"/>
-                                <w:lang w:val="fr-FR"/>
-                              </w:rPr>
-                              <w:t xml:space="preserve"> 3,</w:t>
+                              <w:t>": 3,</w:t>
                             </w:r>
                           </w:p>
                           <w:p>
@@ -3282,7 +4369,6 @@
                               <w:t>QueuedMessages</w:t>
                             </w:r>
                             <w:proofErr w:type="spellEnd"/>
-                            <w:proofErr w:type="gramStart"/>
                             <w:r>
                               <w:rPr>
                                 <w:rFonts w:ascii="Aptos Mono" w:hAnsi="Aptos Mono"/>
@@ -3292,19 +4378,7 @@
                                 <w:highlight w:val="none"/>
                                 <w:lang w:val="fr-FR"/>
                               </w:rPr>
-                              <w:t>":</w:t>
-                            </w:r>
-                            <w:proofErr w:type="gramEnd"/>
-                            <w:r>
-                              <w:rPr>
-                                <w:rFonts w:ascii="Aptos Mono" w:hAnsi="Aptos Mono"/>
-                                <w:color w:val="000000" w:themeColor="text1"/>
-                                <w:sz w:val="16"/>
-                                <w:szCs w:val="16"/>
-                                <w:highlight w:val="none"/>
-                                <w:lang w:val="fr-FR"/>
-                              </w:rPr>
-                              <w:t xml:space="preserve"> 3,</w:t>
+                              <w:t>": 3,</w:t>
                             </w:r>
                           </w:p>
                           <w:p>
@@ -3485,7 +4559,6 @@
                               <w:t>QueueName</w:t>
                             </w:r>
                             <w:proofErr w:type="spellEnd"/>
-                            <w:proofErr w:type="gramStart"/>
                             <w:r>
                               <w:rPr>
                                 <w:rFonts w:ascii="Aptos Mono" w:hAnsi="Aptos Mono"/>
@@ -3495,19 +4568,7 @@
                                 <w:highlight w:val="none"/>
                                 <w:lang w:val="fr-FR"/>
                               </w:rPr>
-                              <w:t>":</w:t>
-                            </w:r>
-                            <w:proofErr w:type="gramEnd"/>
-                            <w:r>
-                              <w:rPr>
-                                <w:rFonts w:ascii="Aptos Mono" w:hAnsi="Aptos Mono"/>
-                                <w:color w:val="000000" w:themeColor="text1"/>
-                                <w:sz w:val="16"/>
-                                <w:szCs w:val="16"/>
-                                <w:highlight w:val="none"/>
-                                <w:lang w:val="fr-FR"/>
-                              </w:rPr>
-                              <w:t xml:space="preserve"> "DemoQueue2",</w:t>
+                              <w:t>": "DemoQueue2",</w:t>
                             </w:r>
                           </w:p>
                           <w:p>
@@ -3546,7 +4607,6 @@
                               <w:t>PreviousQueuedMessages</w:t>
                             </w:r>
                             <w:proofErr w:type="spellEnd"/>
-                            <w:proofErr w:type="gramStart"/>
                             <w:r>
                               <w:rPr>
                                 <w:rFonts w:ascii="Aptos Mono" w:hAnsi="Aptos Mono"/>
@@ -3556,19 +4616,7 @@
                                 <w:highlight w:val="none"/>
                                 <w:lang w:val="fr-FR"/>
                               </w:rPr>
-                              <w:t>":</w:t>
-                            </w:r>
-                            <w:proofErr w:type="gramEnd"/>
-                            <w:r>
-                              <w:rPr>
-                                <w:rFonts w:ascii="Aptos Mono" w:hAnsi="Aptos Mono"/>
-                                <w:color w:val="000000" w:themeColor="text1"/>
-                                <w:sz w:val="16"/>
-                                <w:szCs w:val="16"/>
-                                <w:highlight w:val="none"/>
-                                <w:lang w:val="fr-FR"/>
-                              </w:rPr>
-                              <w:t xml:space="preserve"> 2,</w:t>
+                              <w:t>": 2,</w:t>
                             </w:r>
                           </w:p>
                           <w:p>
@@ -3607,7 +4655,6 @@
                               <w:t>QueuedMessages</w:t>
                             </w:r>
                             <w:proofErr w:type="spellEnd"/>
-                            <w:proofErr w:type="gramStart"/>
                             <w:r>
                               <w:rPr>
                                 <w:rFonts w:ascii="Aptos Mono" w:hAnsi="Aptos Mono"/>
@@ -3617,19 +4664,7 @@
                                 <w:highlight w:val="none"/>
                                 <w:lang w:val="fr-FR"/>
                               </w:rPr>
-                              <w:t>":</w:t>
-                            </w:r>
-                            <w:proofErr w:type="gramEnd"/>
-                            <w:r>
-                              <w:rPr>
-                                <w:rFonts w:ascii="Aptos Mono" w:hAnsi="Aptos Mono"/>
-                                <w:color w:val="000000" w:themeColor="text1"/>
-                                <w:sz w:val="16"/>
-                                <w:szCs w:val="16"/>
-                                <w:highlight w:val="none"/>
-                                <w:lang w:val="fr-FR"/>
-                              </w:rPr>
-                              <w:t xml:space="preserve"> 2,</w:t>
+                              <w:t>": 2,</w:t>
                             </w:r>
                           </w:p>
                           <w:p>
@@ -3653,31 +4688,7 @@
                                 <w:highlight w:val="none"/>
                                 <w:lang w:val="fr-FR"/>
                               </w:rPr>
-                              <w:t xml:space="preserve">      "Active</w:t>
-                            </w:r>
-                            <w:proofErr w:type="gramStart"/>
-                            <w:r>
-                              <w:rPr>
-                                <w:rFonts w:ascii="Aptos Mono" w:hAnsi="Aptos Mono"/>
-                                <w:color w:val="000000" w:themeColor="text1"/>
-                                <w:sz w:val="16"/>
-                                <w:szCs w:val="16"/>
-                                <w:highlight w:val="none"/>
-                                <w:lang w:val="fr-FR"/>
-                              </w:rPr>
-                              <w:t>":</w:t>
-                            </w:r>
-                            <w:proofErr w:type="gramEnd"/>
-                            <w:r>
-                              <w:rPr>
-                                <w:rFonts w:ascii="Aptos Mono" w:hAnsi="Aptos Mono"/>
-                                <w:color w:val="000000" w:themeColor="text1"/>
-                                <w:sz w:val="16"/>
-                                <w:szCs w:val="16"/>
-                                <w:highlight w:val="none"/>
-                                <w:lang w:val="fr-FR"/>
-                              </w:rPr>
-                              <w:t xml:space="preserve"> </w:t>
+                              <w:t xml:space="preserve">      "Active": </w:t>
                             </w:r>
                             <w:proofErr w:type="spellStart"/>
                             <w:r>
@@ -3892,31 +4903,7 @@
                           <w:highlight w:val="none"/>
                           <w:lang w:val="fr-FR"/>
                         </w:rPr>
-                        <w:t xml:space="preserve">  "Client</w:t>
-                      </w:r>
-                      <w:proofErr w:type="gramStart"/>
-                      <w:r>
-                        <w:rPr>
-                          <w:rFonts w:ascii="Aptos Mono" w:hAnsi="Aptos Mono"/>
-                          <w:color w:val="000000" w:themeColor="text1"/>
-                          <w:sz w:val="16"/>
-                          <w:szCs w:val="16"/>
-                          <w:highlight w:val="none"/>
-                          <w:lang w:val="fr-FR"/>
-                        </w:rPr>
-                        <w:t>":</w:t>
-                      </w:r>
-                      <w:proofErr w:type="gramEnd"/>
-                      <w:r>
-                        <w:rPr>
-                          <w:rFonts w:ascii="Aptos Mono" w:hAnsi="Aptos Mono"/>
-                          <w:color w:val="000000" w:themeColor="text1"/>
-                          <w:sz w:val="16"/>
-                          <w:szCs w:val="16"/>
-                          <w:highlight w:val="none"/>
-                          <w:lang w:val="fr-FR"/>
-                        </w:rPr>
-                        <w:t xml:space="preserve"> "</w:t>
+                        <w:t xml:space="preserve">  "Client": "</w:t>
                       </w:r>
                       <w:proofErr w:type="spellStart"/>
                       <w:r>
@@ -3979,7 +4966,6 @@
                         <w:t>Environment</w:t>
                       </w:r>
                       <w:proofErr w:type="spellEnd"/>
-                      <w:proofErr w:type="gramStart"/>
                       <w:r>
                         <w:rPr>
                           <w:rFonts w:ascii="Aptos Mono" w:hAnsi="Aptos Mono"/>
@@ -3989,19 +4975,7 @@
                           <w:highlight w:val="none"/>
                           <w:lang w:val="fr-FR"/>
                         </w:rPr>
-                        <w:t>":</w:t>
-                      </w:r>
-                      <w:proofErr w:type="gramEnd"/>
-                      <w:r>
-                        <w:rPr>
-                          <w:rFonts w:ascii="Aptos Mono" w:hAnsi="Aptos Mono"/>
-                          <w:color w:val="000000" w:themeColor="text1"/>
-                          <w:sz w:val="16"/>
-                          <w:szCs w:val="16"/>
-                          <w:highlight w:val="none"/>
-                          <w:lang w:val="fr-FR"/>
-                        </w:rPr>
-                        <w:t xml:space="preserve"> "dev",</w:t>
+                        <w:t>": "dev",</w:t>
                       </w:r>
                     </w:p>
                     <w:p>
@@ -4025,55 +4999,7 @@
                           <w:highlight w:val="none"/>
                           <w:lang w:val="fr-FR"/>
                         </w:rPr>
-                        <w:t xml:space="preserve">  "Timestamp</w:t>
-                      </w:r>
-                      <w:proofErr w:type="gramStart"/>
-                      <w:r>
-                        <w:rPr>
-                          <w:rFonts w:ascii="Aptos Mono" w:hAnsi="Aptos Mono"/>
-                          <w:color w:val="000000" w:themeColor="text1"/>
-                          <w:sz w:val="16"/>
-                          <w:szCs w:val="16"/>
-                          <w:highlight w:val="none"/>
-                          <w:lang w:val="fr-FR"/>
-                        </w:rPr>
-                        <w:t>":</w:t>
-                      </w:r>
-                      <w:proofErr w:type="gramEnd"/>
-                      <w:r>
-                        <w:rPr>
-                          <w:rFonts w:ascii="Aptos Mono" w:hAnsi="Aptos Mono"/>
-                          <w:color w:val="000000" w:themeColor="text1"/>
-                          <w:sz w:val="16"/>
-                          <w:szCs w:val="16"/>
-                          <w:highlight w:val="none"/>
-                          <w:lang w:val="fr-FR"/>
-                        </w:rPr>
-                        <w:t xml:space="preserve"> "2026-10-29T</w:t>
-                      </w:r>
-                      <w:proofErr w:type="gramStart"/>
-                      <w:r>
-                        <w:rPr>
-                          <w:rFonts w:ascii="Aptos Mono" w:hAnsi="Aptos Mono"/>
-                          <w:color w:val="000000" w:themeColor="text1"/>
-                          <w:sz w:val="16"/>
-                          <w:szCs w:val="16"/>
-                          <w:highlight w:val="none"/>
-                          <w:lang w:val="fr-FR"/>
-                        </w:rPr>
-                        <w:t>09:33:</w:t>
-                      </w:r>
-                      <w:proofErr w:type="gramEnd"/>
-                      <w:r>
-                        <w:rPr>
-                          <w:rFonts w:ascii="Aptos Mono" w:hAnsi="Aptos Mono"/>
-                          <w:color w:val="000000" w:themeColor="text1"/>
-                          <w:sz w:val="16"/>
-                          <w:szCs w:val="16"/>
-                          <w:highlight w:val="none"/>
-                          <w:lang w:val="fr-FR"/>
-                        </w:rPr>
-                        <w:t>20.692Z",</w:t>
+                        <w:t xml:space="preserve">  "Timestamp": "2026-10-29T09:33:20.692Z",</w:t>
                       </w:r>
                     </w:p>
                     <w:p>
@@ -4112,7 +5038,6 @@
                         <w:t>AffectedQueues</w:t>
                       </w:r>
                       <w:proofErr w:type="spellEnd"/>
-                      <w:proofErr w:type="gramStart"/>
                       <w:r>
                         <w:rPr>
                           <w:rFonts w:ascii="Aptos Mono" w:hAnsi="Aptos Mono"/>
@@ -4122,19 +5047,7 @@
                           <w:highlight w:val="none"/>
                           <w:lang w:val="fr-FR"/>
                         </w:rPr>
-                        <w:t>":</w:t>
-                      </w:r>
-                      <w:proofErr w:type="gramEnd"/>
-                      <w:r>
-                        <w:rPr>
-                          <w:rFonts w:ascii="Aptos Mono" w:hAnsi="Aptos Mono"/>
-                          <w:color w:val="000000" w:themeColor="text1"/>
-                          <w:sz w:val="16"/>
-                          <w:szCs w:val="16"/>
-                          <w:highlight w:val="none"/>
-                          <w:lang w:val="fr-FR"/>
-                        </w:rPr>
-                        <w:t xml:space="preserve"> [</w:t>
+                        <w:t>": [</w:t>
                       </w:r>
                     </w:p>
                     <w:p>
@@ -4197,7 +5110,6 @@
                         <w:t>QueueName</w:t>
                       </w:r>
                       <w:proofErr w:type="spellEnd"/>
-                      <w:proofErr w:type="gramStart"/>
                       <w:r>
                         <w:rPr>
                           <w:rFonts w:ascii="Aptos Mono" w:hAnsi="Aptos Mono"/>
@@ -4207,19 +5119,7 @@
                           <w:highlight w:val="none"/>
                           <w:lang w:val="fr-FR"/>
                         </w:rPr>
-                        <w:t>":</w:t>
-                      </w:r>
-                      <w:proofErr w:type="gramEnd"/>
-                      <w:r>
-                        <w:rPr>
-                          <w:rFonts w:ascii="Aptos Mono" w:hAnsi="Aptos Mono"/>
-                          <w:color w:val="000000" w:themeColor="text1"/>
-                          <w:sz w:val="16"/>
-                          <w:szCs w:val="16"/>
-                          <w:highlight w:val="none"/>
-                          <w:lang w:val="fr-FR"/>
-                        </w:rPr>
-                        <w:t xml:space="preserve"> "</w:t>
+                        <w:t>": "</w:t>
                       </w:r>
                       <w:proofErr w:type="spellStart"/>
                       <w:r>
@@ -4282,7 +5182,6 @@
                         <w:t>PreviousQueuedMessages</w:t>
                       </w:r>
                       <w:proofErr w:type="spellEnd"/>
-                      <w:proofErr w:type="gramStart"/>
                       <w:r>
                         <w:rPr>
                           <w:rFonts w:ascii="Aptos Mono" w:hAnsi="Aptos Mono"/>
@@ -4292,19 +5191,7 @@
                           <w:highlight w:val="none"/>
                           <w:lang w:val="fr-FR"/>
                         </w:rPr>
-                        <w:t>":</w:t>
-                      </w:r>
-                      <w:proofErr w:type="gramEnd"/>
-                      <w:r>
-                        <w:rPr>
-                          <w:rFonts w:ascii="Aptos Mono" w:hAnsi="Aptos Mono"/>
-                          <w:color w:val="000000" w:themeColor="text1"/>
-                          <w:sz w:val="16"/>
-                          <w:szCs w:val="16"/>
-                          <w:highlight w:val="none"/>
-                          <w:lang w:val="fr-FR"/>
-                        </w:rPr>
-                        <w:t xml:space="preserve"> 3,</w:t>
+                        <w:t>": 3,</w:t>
                       </w:r>
                     </w:p>
                     <w:p>
@@ -4343,7 +5230,6 @@
                         <w:t>QueuedMessages</w:t>
                       </w:r>
                       <w:proofErr w:type="spellEnd"/>
-                      <w:proofErr w:type="gramStart"/>
                       <w:r>
                         <w:rPr>
                           <w:rFonts w:ascii="Aptos Mono" w:hAnsi="Aptos Mono"/>
@@ -4353,19 +5239,7 @@
                           <w:highlight w:val="none"/>
                           <w:lang w:val="fr-FR"/>
                         </w:rPr>
-                        <w:t>":</w:t>
-                      </w:r>
-                      <w:proofErr w:type="gramEnd"/>
-                      <w:r>
-                        <w:rPr>
-                          <w:rFonts w:ascii="Aptos Mono" w:hAnsi="Aptos Mono"/>
-                          <w:color w:val="000000" w:themeColor="text1"/>
-                          <w:sz w:val="16"/>
-                          <w:szCs w:val="16"/>
-                          <w:highlight w:val="none"/>
-                          <w:lang w:val="fr-FR"/>
-                        </w:rPr>
-                        <w:t xml:space="preserve"> 3,</w:t>
+                        <w:t>": 3,</w:t>
                       </w:r>
                     </w:p>
                     <w:p>
@@ -4546,7 +5420,6 @@
                         <w:t>QueueName</w:t>
                       </w:r>
                       <w:proofErr w:type="spellEnd"/>
-                      <w:proofErr w:type="gramStart"/>
                       <w:r>
                         <w:rPr>
                           <w:rFonts w:ascii="Aptos Mono" w:hAnsi="Aptos Mono"/>
@@ -4556,19 +5429,7 @@
                           <w:highlight w:val="none"/>
                           <w:lang w:val="fr-FR"/>
                         </w:rPr>
-                        <w:t>":</w:t>
-                      </w:r>
-                      <w:proofErr w:type="gramEnd"/>
-                      <w:r>
-                        <w:rPr>
-                          <w:rFonts w:ascii="Aptos Mono" w:hAnsi="Aptos Mono"/>
-                          <w:color w:val="000000" w:themeColor="text1"/>
-                          <w:sz w:val="16"/>
-                          <w:szCs w:val="16"/>
-                          <w:highlight w:val="none"/>
-                          <w:lang w:val="fr-FR"/>
-                        </w:rPr>
-                        <w:t xml:space="preserve"> "DemoQueue2",</w:t>
+                        <w:t>": "DemoQueue2",</w:t>
                       </w:r>
                     </w:p>
                     <w:p>
@@ -4607,7 +5468,6 @@
                         <w:t>PreviousQueuedMessages</w:t>
                       </w:r>
                       <w:proofErr w:type="spellEnd"/>
-                      <w:proofErr w:type="gramStart"/>
                       <w:r>
                         <w:rPr>
                           <w:rFonts w:ascii="Aptos Mono" w:hAnsi="Aptos Mono"/>
@@ -4617,19 +5477,7 @@
                           <w:highlight w:val="none"/>
                           <w:lang w:val="fr-FR"/>
                         </w:rPr>
-                        <w:t>":</w:t>
-                      </w:r>
-                      <w:proofErr w:type="gramEnd"/>
-                      <w:r>
-                        <w:rPr>
-                          <w:rFonts w:ascii="Aptos Mono" w:hAnsi="Aptos Mono"/>
-                          <w:color w:val="000000" w:themeColor="text1"/>
-                          <w:sz w:val="16"/>
-                          <w:szCs w:val="16"/>
-                          <w:highlight w:val="none"/>
-                          <w:lang w:val="fr-FR"/>
-                        </w:rPr>
-                        <w:t xml:space="preserve"> 2,</w:t>
+                        <w:t>": 2,</w:t>
                       </w:r>
                     </w:p>
                     <w:p>
@@ -4668,7 +5516,6 @@
                         <w:t>QueuedMessages</w:t>
                       </w:r>
                       <w:proofErr w:type="spellEnd"/>
-                      <w:proofErr w:type="gramStart"/>
                       <w:r>
                         <w:rPr>
                           <w:rFonts w:ascii="Aptos Mono" w:hAnsi="Aptos Mono"/>
@@ -4678,19 +5525,7 @@
                           <w:highlight w:val="none"/>
                           <w:lang w:val="fr-FR"/>
                         </w:rPr>
-                        <w:t>":</w:t>
-                      </w:r>
-                      <w:proofErr w:type="gramEnd"/>
-                      <w:r>
-                        <w:rPr>
-                          <w:rFonts w:ascii="Aptos Mono" w:hAnsi="Aptos Mono"/>
-                          <w:color w:val="000000" w:themeColor="text1"/>
-                          <w:sz w:val="16"/>
-                          <w:szCs w:val="16"/>
-                          <w:highlight w:val="none"/>
-                          <w:lang w:val="fr-FR"/>
-                        </w:rPr>
-                        <w:t xml:space="preserve"> 2,</w:t>
+                        <w:t>": 2,</w:t>
                       </w:r>
                     </w:p>
                     <w:p>
@@ -4714,31 +5549,7 @@
                           <w:highlight w:val="none"/>
                           <w:lang w:val="fr-FR"/>
                         </w:rPr>
-                        <w:t xml:space="preserve">      "Active</w:t>
-                      </w:r>
-                      <w:proofErr w:type="gramStart"/>
-                      <w:r>
-                        <w:rPr>
-                          <w:rFonts w:ascii="Aptos Mono" w:hAnsi="Aptos Mono"/>
-                          <w:color w:val="000000" w:themeColor="text1"/>
-                          <w:sz w:val="16"/>
-                          <w:szCs w:val="16"/>
-                          <w:highlight w:val="none"/>
-                          <w:lang w:val="fr-FR"/>
-                        </w:rPr>
-                        <w:t>":</w:t>
-                      </w:r>
-                      <w:proofErr w:type="gramEnd"/>
-                      <w:r>
-                        <w:rPr>
-                          <w:rFonts w:ascii="Aptos Mono" w:hAnsi="Aptos Mono"/>
-                          <w:color w:val="000000" w:themeColor="text1"/>
-                          <w:sz w:val="16"/>
-                          <w:szCs w:val="16"/>
-                          <w:highlight w:val="none"/>
-                          <w:lang w:val="fr-FR"/>
-                        </w:rPr>
-                        <w:t xml:space="preserve"> </w:t>
+                        <w:t xml:space="preserve">      "Active": </w:t>
                       </w:r>
                       <w:proofErr w:type="spellStart"/>
                       <w:r>
@@ -4998,6 +5809,7 @@
       </w:pPr>
       <w:r>
         <w:rPr>
+          <w:noProof/>
           <w:lang w:val="es-ES"/>
         </w:rPr>
         <w:drawing>
@@ -5016,7 +5828,7 @@
                     <pic:cNvPicPr/>
                   </pic:nvPicPr>
                   <pic:blipFill>
-                    <a:blip r:embed="rId22"/>
+                    <a:blip r:embed="rId23"/>
                     <a:stretch>
                       <a:fillRect/>
                     </a:stretch>
@@ -5068,7 +5880,6 @@
         <w:t xml:space="preserve">para generar un mensaje </w:t>
       </w:r>
       <w:proofErr w:type="spellStart"/>
-      <w:proofErr w:type="gramStart"/>
       <w:r>
         <w:rPr>
           <w:lang w:val="es-ES"/>
@@ -5076,7 +5887,6 @@
         <w:t>user-friendly</w:t>
       </w:r>
       <w:proofErr w:type="spellEnd"/>
-      <w:proofErr w:type="gramEnd"/>
       <w:r>
         <w:rPr>
           <w:lang w:val="es-ES"/>
@@ -5152,7 +5962,7 @@
                     <pic:cNvPicPr/>
                   </pic:nvPicPr>
                   <pic:blipFill>
-                    <a:blip r:embed="rId23"/>
+                    <a:blip r:embed="rId24"/>
                     <a:stretch>
                       <a:fillRect/>
                     </a:stretch>
@@ -5215,6 +6025,7 @@
       </w:r>
       <w:r>
         <w:rPr>
+          <w:noProof/>
           <w:lang w:val="es-ES"/>
         </w:rPr>
         <w:drawing>
@@ -5233,7 +6044,7 @@
                     <pic:cNvPicPr/>
                   </pic:nvPicPr>
                   <pic:blipFill>
-                    <a:blip r:embed="rId24"/>
+                    <a:blip r:embed="rId25"/>
                     <a:stretch>
                       <a:fillRect/>
                     </a:stretch>
@@ -5290,21 +6101,7 @@
         <w:rPr>
           <w:lang w:val="es-ES"/>
         </w:rPr>
-        <w:t xml:space="preserve"> al responsable de configurar la </w:t>
-      </w:r>
-      <w:proofErr w:type="gramStart"/>
-      <w:r>
-        <w:rPr>
-          <w:lang w:val="es-ES"/>
-        </w:rPr>
-        <w:t>app</w:t>
-      </w:r>
-      <w:proofErr w:type="gramEnd"/>
-      <w:r>
-        <w:rPr>
-          <w:lang w:val="es-ES"/>
-        </w:rPr>
-        <w:t xml:space="preserve">. En particular, deberá entregar el </w:t>
+        <w:t xml:space="preserve"> al responsable de configurar la app. En particular, deberá entregar el </w:t>
       </w:r>
       <w:proofErr w:type="spellStart"/>
       <w:r>
@@ -5357,6 +6154,7 @@
       </w:pPr>
       <w:r>
         <w:rPr>
+          <w:noProof/>
           <w:lang w:val="es-ES"/>
         </w:rPr>
         <w:lastRenderedPageBreak/>
@@ -5376,7 +6174,7 @@
                     <pic:cNvPicPr/>
                   </pic:nvPicPr>
                   <pic:blipFill>
-                    <a:blip r:embed="rId25"/>
+                    <a:blip r:embed="rId26"/>
                     <a:stretch>
                       <a:fillRect/>
                     </a:stretch>
@@ -5423,12 +6221,14 @@
           <w:lang w:val="es-ES"/>
         </w:rPr>
       </w:pPr>
+      <w:bookmarkStart w:id="15" w:name="_Toc244246155"/>
       <w:r>
         <w:rPr>
           <w:lang w:val="es-ES"/>
         </w:rPr>
         <w:t>Configuración de variables de entorno</w:t>
       </w:r>
+      <w:bookmarkEnd w:id="15"/>
     </w:p>
     <w:p>
       <w:pPr>
@@ -5638,21 +6438,7 @@
         <w:rPr>
           <w:lang w:val="es-ES"/>
         </w:rPr>
-        <w:t xml:space="preserve">Una copia local del repositorio de la </w:t>
-      </w:r>
-      <w:proofErr w:type="gramStart"/>
-      <w:r>
-        <w:rPr>
-          <w:lang w:val="es-ES"/>
-        </w:rPr>
-        <w:t>app</w:t>
-      </w:r>
-      <w:proofErr w:type="gramEnd"/>
-      <w:r>
-        <w:rPr>
-          <w:lang w:val="es-ES"/>
-        </w:rPr>
-        <w:t xml:space="preserve"> </w:t>
+        <w:t xml:space="preserve">Una copia local del repositorio de la app </w:t>
       </w:r>
       <w:proofErr w:type="spellStart"/>
       <w:r>
@@ -5765,21 +6551,7 @@
         <w:rPr>
           <w:lang w:val="es-ES"/>
         </w:rPr>
-        <w:t xml:space="preserve">: es el slug (el sufijo) que se añadirá al nombre de la </w:t>
-      </w:r>
-      <w:proofErr w:type="gramStart"/>
-      <w:r>
-        <w:rPr>
-          <w:lang w:val="es-ES"/>
-        </w:rPr>
-        <w:t>app</w:t>
-      </w:r>
-      <w:proofErr w:type="gramEnd"/>
-      <w:r>
-        <w:rPr>
-          <w:lang w:val="es-ES"/>
-        </w:rPr>
-        <w:t xml:space="preserve">. El objetivo es evitar colisiones en el espacio de nombres, de modo que debe ser algo que identifique el cliente y entorno siendo monitorizados. Por ejemplo: </w:t>
+        <w:t xml:space="preserve">: es el slug (el sufijo) que se añadirá al nombre de la app. El objetivo es evitar colisiones en el espacio de nombres, de modo que debe ser algo que identifique el cliente y entorno siendo monitorizados. Por ejemplo: </w:t>
       </w:r>
       <w:proofErr w:type="spellStart"/>
       <w:r>
@@ -5840,54 +6612,57 @@
         <w:rPr>
           <w:lang w:val="es-ES"/>
         </w:rPr>
-        <w:t>cpi_api_service_key</w:t>
-      </w:r>
-      <w:proofErr w:type="spellEnd"/>
-      <w:r>
-        <w:rPr>
-          <w:lang w:val="es-ES"/>
-        </w:rPr>
-        <w:t>:</w:t>
-      </w:r>
-      <w:r>
-        <w:rPr>
-          <w:lang w:val="es-ES"/>
-        </w:rPr>
-        <w:t xml:space="preserve"> aquí pega</w:t>
-      </w:r>
-      <w:r>
-        <w:rPr>
-          <w:lang w:val="es-ES"/>
-        </w:rPr>
-        <w:t xml:space="preserve">remos el JSON de la </w:t>
-      </w:r>
-      <w:proofErr w:type="spellStart"/>
-      <w:r>
-        <w:rPr>
-          <w:lang w:val="es-ES"/>
-        </w:rPr>
-        <w:t>service</w:t>
-      </w:r>
-      <w:proofErr w:type="spellEnd"/>
-      <w:r>
-        <w:rPr>
-          <w:lang w:val="es-ES"/>
-        </w:rPr>
-        <w:t xml:space="preserve"> </w:t>
-      </w:r>
-      <w:proofErr w:type="spellStart"/>
-      <w:r>
-        <w:rPr>
-          <w:lang w:val="es-ES"/>
-        </w:rPr>
-        <w:t>key</w:t>
-      </w:r>
-      <w:proofErr w:type="spellEnd"/>
-      <w:r>
-        <w:rPr>
-          <w:lang w:val="es-ES"/>
-        </w:rPr>
-        <w:t xml:space="preserve"> generada para consultar la API de producto (plan: api).</w:t>
+        <w:t>cf_region</w:t>
+      </w:r>
+      <w:proofErr w:type="spellEnd"/>
+      <w:r>
+        <w:rPr>
+          <w:lang w:val="es-ES"/>
+        </w:rPr>
+        <w:t xml:space="preserve">: región de Cloud Foundry donde hemos desplegado la app. Puede consultarse en el </w:t>
+      </w:r>
+      <w:proofErr w:type="spellStart"/>
+      <w:r>
+        <w:rPr>
+          <w:lang w:val="es-ES"/>
+        </w:rPr>
+        <w:t>overview</w:t>
+      </w:r>
+      <w:proofErr w:type="spellEnd"/>
+      <w:r>
+        <w:rPr>
+          <w:lang w:val="es-ES"/>
+        </w:rPr>
+        <w:t xml:space="preserve"> de la </w:t>
+      </w:r>
+      <w:proofErr w:type="spellStart"/>
+      <w:r>
+        <w:rPr>
+          <w:lang w:val="es-ES"/>
+        </w:rPr>
+        <w:t>subaccount</w:t>
+      </w:r>
+      <w:proofErr w:type="spellEnd"/>
+      <w:r>
+        <w:rPr>
+          <w:lang w:val="es-ES"/>
+        </w:rPr>
+        <w:t xml:space="preserve"> de BTP (véase la sección </w:t>
+      </w:r>
+      <w:hyperlink w:anchor="_Despliegue_al_entorno" w:history="1">
+        <w:r>
+          <w:rPr>
+            <w:rStyle w:val="Hipervnculo"/>
+            <w:lang w:val="es-ES"/>
+          </w:rPr>
+          <w:t>Despliegue al entorno Cloud Foundry</w:t>
+        </w:r>
+      </w:hyperlink>
+      <w:r>
+        <w:rPr>
+          <w:lang w:val="es-ES"/>
+        </w:rPr>
+        <w:t>).</w:t>
       </w:r>
     </w:p>
     <w:p>
@@ -5906,7 +6681,7 @@
         <w:rPr>
           <w:lang w:val="es-ES"/>
         </w:rPr>
-        <w:t>alert_service_key</w:t>
+        <w:t>cpi_api_service_key</w:t>
       </w:r>
       <w:proofErr w:type="spellEnd"/>
       <w:r>
@@ -5919,13 +6694,13 @@
         <w:rPr>
           <w:lang w:val="es-ES"/>
         </w:rPr>
-        <w:t xml:space="preserve"> aquí pegaremos</w:t>
-      </w:r>
-      <w:r>
-        <w:rPr>
-          <w:lang w:val="es-ES"/>
-        </w:rPr>
-        <w:t xml:space="preserve"> el JSON de la </w:t>
+        <w:t xml:space="preserve"> aquí pega</w:t>
+      </w:r>
+      <w:r>
+        <w:rPr>
+          <w:lang w:val="es-ES"/>
+        </w:rPr>
+        <w:t xml:space="preserve">remos el JSON de la </w:t>
       </w:r>
       <w:proofErr w:type="spellStart"/>
       <w:r>
@@ -5953,35 +6728,7 @@
         <w:rPr>
           <w:lang w:val="es-ES"/>
         </w:rPr>
-        <w:t xml:space="preserve"> generada para enviar peticiones al </w:t>
-      </w:r>
-      <w:proofErr w:type="spellStart"/>
-      <w:r>
-        <w:rPr>
-          <w:lang w:val="es-ES"/>
-        </w:rPr>
-        <w:t>endpoint</w:t>
-      </w:r>
-      <w:proofErr w:type="spellEnd"/>
-      <w:r>
-        <w:rPr>
-          <w:lang w:val="es-ES"/>
-        </w:rPr>
-        <w:t xml:space="preserve"> de integración (plan: </w:t>
-      </w:r>
-      <w:proofErr w:type="spellStart"/>
-      <w:r>
-        <w:rPr>
-          <w:lang w:val="es-ES"/>
-        </w:rPr>
-        <w:t>integration</w:t>
-      </w:r>
-      <w:proofErr w:type="spellEnd"/>
-      <w:r>
-        <w:rPr>
-          <w:lang w:val="es-ES"/>
-        </w:rPr>
-        <w:t>-suite).</w:t>
+        <w:t xml:space="preserve"> generada para consultar la API de producto (plan: api).</w:t>
       </w:r>
     </w:p>
     <w:p>
@@ -6001,76 +6748,82 @@
           <w:lang w:val="es-ES"/>
         </w:rPr>
         <w:lastRenderedPageBreak/>
-        <w:t>alert_endpoint_path</w:t>
-      </w:r>
-      <w:proofErr w:type="spellEnd"/>
-      <w:r>
-        <w:rPr>
-          <w:lang w:val="es-ES"/>
-        </w:rPr>
-        <w:t xml:space="preserve">: aquí pegaremos el </w:t>
-      </w:r>
-      <w:proofErr w:type="spellStart"/>
-      <w:r>
-        <w:rPr>
-          <w:lang w:val="es-ES"/>
-        </w:rPr>
-        <w:t>path</w:t>
-      </w:r>
-      <w:proofErr w:type="spellEnd"/>
-      <w:r>
-        <w:rPr>
-          <w:lang w:val="es-ES"/>
-        </w:rPr>
-        <w:t xml:space="preserve"> a la integración que manejará las excepciones (</w:t>
-      </w:r>
-      <w:proofErr w:type="spellStart"/>
-      <w:r>
-        <w:rPr>
-          <w:lang w:val="es-ES"/>
-        </w:rPr>
-        <w:t>p.e</w:t>
-      </w:r>
-      <w:proofErr w:type="spellEnd"/>
-      <w:r>
-        <w:rPr>
-          <w:lang w:val="es-ES"/>
-        </w:rPr>
-        <w:t xml:space="preserve">.: </w:t>
-      </w:r>
-      <w:r>
-        <w:rPr>
-          <w:lang w:val="es-ES"/>
-        </w:rPr>
-        <w:t>/http/</w:t>
-      </w:r>
-      <w:proofErr w:type="spellStart"/>
-      <w:r>
-        <w:rPr>
-          <w:lang w:val="es-ES"/>
-        </w:rPr>
-        <w:t>monitoring</w:t>
-      </w:r>
-      <w:proofErr w:type="spellEnd"/>
-      <w:r>
-        <w:rPr>
-          <w:lang w:val="es-ES"/>
-        </w:rPr>
-        <w:t>/pipeline/</w:t>
-      </w:r>
-      <w:proofErr w:type="spellStart"/>
-      <w:r>
-        <w:rPr>
-          <w:lang w:val="es-ES"/>
-        </w:rPr>
-        <w:t>avvale</w:t>
-      </w:r>
-      <w:proofErr w:type="spellEnd"/>
-      <w:r>
-        <w:rPr>
-          <w:lang w:val="es-ES"/>
-        </w:rPr>
-        <w:t>).</w:t>
+        <w:t>alert_service_key</w:t>
+      </w:r>
+      <w:proofErr w:type="spellEnd"/>
+      <w:r>
+        <w:rPr>
+          <w:lang w:val="es-ES"/>
+        </w:rPr>
+        <w:t>:</w:t>
+      </w:r>
+      <w:r>
+        <w:rPr>
+          <w:lang w:val="es-ES"/>
+        </w:rPr>
+        <w:t xml:space="preserve"> aquí pegaremos</w:t>
+      </w:r>
+      <w:r>
+        <w:rPr>
+          <w:lang w:val="es-ES"/>
+        </w:rPr>
+        <w:t xml:space="preserve"> el JSON de la </w:t>
+      </w:r>
+      <w:proofErr w:type="spellStart"/>
+      <w:r>
+        <w:rPr>
+          <w:lang w:val="es-ES"/>
+        </w:rPr>
+        <w:t>service</w:t>
+      </w:r>
+      <w:proofErr w:type="spellEnd"/>
+      <w:r>
+        <w:rPr>
+          <w:lang w:val="es-ES"/>
+        </w:rPr>
+        <w:t xml:space="preserve"> </w:t>
+      </w:r>
+      <w:proofErr w:type="spellStart"/>
+      <w:r>
+        <w:rPr>
+          <w:lang w:val="es-ES"/>
+        </w:rPr>
+        <w:t>key</w:t>
+      </w:r>
+      <w:proofErr w:type="spellEnd"/>
+      <w:r>
+        <w:rPr>
+          <w:lang w:val="es-ES"/>
+        </w:rPr>
+        <w:t xml:space="preserve"> generada para enviar peticiones al </w:t>
+      </w:r>
+      <w:proofErr w:type="spellStart"/>
+      <w:r>
+        <w:rPr>
+          <w:lang w:val="es-ES"/>
+        </w:rPr>
+        <w:t>endpoint</w:t>
+      </w:r>
+      <w:proofErr w:type="spellEnd"/>
+      <w:r>
+        <w:rPr>
+          <w:lang w:val="es-ES"/>
+        </w:rPr>
+        <w:t xml:space="preserve"> de integración (plan: </w:t>
+      </w:r>
+      <w:proofErr w:type="spellStart"/>
+      <w:r>
+        <w:rPr>
+          <w:lang w:val="es-ES"/>
+        </w:rPr>
+        <w:t>integration</w:t>
+      </w:r>
+      <w:proofErr w:type="spellEnd"/>
+      <w:r>
+        <w:rPr>
+          <w:lang w:val="es-ES"/>
+        </w:rPr>
+        <w:t>-suite).</w:t>
       </w:r>
     </w:p>
     <w:p>
@@ -6089,14 +6842,28 @@
         <w:rPr>
           <w:lang w:val="es-ES"/>
         </w:rPr>
-        <w:t>client_name</w:t>
-      </w:r>
-      <w:proofErr w:type="spellEnd"/>
-      <w:r>
-        <w:rPr>
-          <w:lang w:val="es-ES"/>
-        </w:rPr>
-        <w:t>: aquí definiremos el nombre del cliente tal cual queremos que aparezca en la alerta generada (</w:t>
+        <w:t>alert_endpoint_path</w:t>
+      </w:r>
+      <w:proofErr w:type="spellEnd"/>
+      <w:r>
+        <w:rPr>
+          <w:lang w:val="es-ES"/>
+        </w:rPr>
+        <w:t xml:space="preserve">: aquí pegaremos el </w:t>
+      </w:r>
+      <w:proofErr w:type="spellStart"/>
+      <w:r>
+        <w:rPr>
+          <w:lang w:val="es-ES"/>
+        </w:rPr>
+        <w:t>path</w:t>
+      </w:r>
+      <w:proofErr w:type="spellEnd"/>
+      <w:r>
+        <w:rPr>
+          <w:lang w:val="es-ES"/>
+        </w:rPr>
+        <w:t xml:space="preserve"> a la integración que manejará las excepciones (</w:t>
       </w:r>
       <w:proofErr w:type="spellStart"/>
       <w:r>
@@ -6112,12 +6879,32 @@
         </w:rPr>
         <w:t xml:space="preserve">.: </w:t>
       </w:r>
-      <w:proofErr w:type="spellStart"/>
-      <w:r>
-        <w:rPr>
-          <w:lang w:val="es-ES"/>
-        </w:rPr>
-        <w:t>Avvale</w:t>
+      <w:r>
+        <w:rPr>
+          <w:lang w:val="es-ES"/>
+        </w:rPr>
+        <w:t>/http/</w:t>
+      </w:r>
+      <w:proofErr w:type="spellStart"/>
+      <w:r>
+        <w:rPr>
+          <w:lang w:val="es-ES"/>
+        </w:rPr>
+        <w:t>monitoring</w:t>
+      </w:r>
+      <w:proofErr w:type="spellEnd"/>
+      <w:r>
+        <w:rPr>
+          <w:lang w:val="es-ES"/>
+        </w:rPr>
+        <w:t>/pipeline/</w:t>
+      </w:r>
+      <w:proofErr w:type="spellStart"/>
+      <w:r>
+        <w:rPr>
+          <w:lang w:val="es-ES"/>
+        </w:rPr>
+        <w:t>avvale</w:t>
       </w:r>
       <w:proofErr w:type="spellEnd"/>
       <w:r>
@@ -6143,20 +6930,14 @@
         <w:rPr>
           <w:lang w:val="es-ES"/>
         </w:rPr>
-        <w:t>e</w:t>
-      </w:r>
-      <w:r>
-        <w:rPr>
-          <w:lang w:val="es-ES"/>
-        </w:rPr>
-        <w:t>nvironment</w:t>
-      </w:r>
-      <w:proofErr w:type="spellEnd"/>
-      <w:r>
-        <w:rPr>
-          <w:lang w:val="es-ES"/>
-        </w:rPr>
-        <w:t>: aquí definiremos el nombre del entorno tal cual queremos que aparezca en la alerta generada (</w:t>
+        <w:t>client_name</w:t>
+      </w:r>
+      <w:proofErr w:type="spellEnd"/>
+      <w:r>
+        <w:rPr>
+          <w:lang w:val="es-ES"/>
+        </w:rPr>
+        <w:t>: aquí definiremos el nombre del cliente tal cual queremos que aparezca en la alerta generada (</w:t>
       </w:r>
       <w:proofErr w:type="spellStart"/>
       <w:r>
@@ -6177,7 +6958,7 @@
         <w:rPr>
           <w:lang w:val="es-ES"/>
         </w:rPr>
-        <w:t>dev</w:t>
+        <w:t>Avvale</w:t>
       </w:r>
       <w:proofErr w:type="spellEnd"/>
       <w:r>
@@ -6203,34 +6984,48 @@
         <w:rPr>
           <w:lang w:val="es-ES"/>
         </w:rPr>
-        <w:t>monitored_queues</w:t>
-      </w:r>
-      <w:proofErr w:type="spellEnd"/>
-      <w:r>
-        <w:rPr>
-          <w:lang w:val="es-ES"/>
-        </w:rPr>
-        <w:t xml:space="preserve">: lista de las colas que queremos monitorizar, separadas por comas, sin espacios; por ejemplo: </w:t>
-      </w:r>
-      <w:proofErr w:type="gramStart"/>
-      <w:r>
-        <w:rPr>
-          <w:lang w:val="es-ES"/>
-        </w:rPr>
-        <w:t>DemoQueue,DemoQueue</w:t>
-      </w:r>
-      <w:proofErr w:type="gramEnd"/>
-      <w:r>
-        <w:rPr>
-          <w:lang w:val="es-ES"/>
-        </w:rPr>
-        <w:t>2</w:t>
-      </w:r>
-      <w:r>
-        <w:rPr>
-          <w:lang w:val="es-ES"/>
-        </w:rPr>
-        <w:t>.</w:t>
+        <w:t>e</w:t>
+      </w:r>
+      <w:r>
+        <w:rPr>
+          <w:lang w:val="es-ES"/>
+        </w:rPr>
+        <w:t>nvironment</w:t>
+      </w:r>
+      <w:proofErr w:type="spellEnd"/>
+      <w:r>
+        <w:rPr>
+          <w:lang w:val="es-ES"/>
+        </w:rPr>
+        <w:t>: aquí definiremos el nombre del entorno tal cual queremos que aparezca en la alerta generada (</w:t>
+      </w:r>
+      <w:proofErr w:type="spellStart"/>
+      <w:r>
+        <w:rPr>
+          <w:lang w:val="es-ES"/>
+        </w:rPr>
+        <w:t>p.e</w:t>
+      </w:r>
+      <w:proofErr w:type="spellEnd"/>
+      <w:r>
+        <w:rPr>
+          <w:lang w:val="es-ES"/>
+        </w:rPr>
+        <w:t xml:space="preserve">.: </w:t>
+      </w:r>
+      <w:proofErr w:type="spellStart"/>
+      <w:r>
+        <w:rPr>
+          <w:lang w:val="es-ES"/>
+        </w:rPr>
+        <w:t>dev</w:t>
+      </w:r>
+      <w:proofErr w:type="spellEnd"/>
+      <w:r>
+        <w:rPr>
+          <w:lang w:val="es-ES"/>
+        </w:rPr>
+        <w:t>).</w:t>
       </w:r>
     </w:p>
     <w:p>
@@ -6249,34 +7044,26 @@
         <w:rPr>
           <w:lang w:val="es-ES"/>
         </w:rPr>
-        <w:t>monitoring_freq_in_minutes</w:t>
-      </w:r>
-      <w:proofErr w:type="spellEnd"/>
-      <w:r>
-        <w:rPr>
-          <w:lang w:val="es-ES"/>
-        </w:rPr>
-        <w:t>: minutos que han de</w:t>
-      </w:r>
-      <w:r>
-        <w:rPr>
-          <w:lang w:val="es-ES"/>
-        </w:rPr>
-        <w:t xml:space="preserve"> pasar entre comprobaciones. Número entero entre comillas dobles, </w:t>
-      </w:r>
-      <w:proofErr w:type="spellStart"/>
-      <w:r>
-        <w:rPr>
-          <w:lang w:val="es-ES"/>
-        </w:rPr>
-        <w:t>p.e</w:t>
-      </w:r>
-      <w:proofErr w:type="spellEnd"/>
-      <w:r>
-        <w:rPr>
-          <w:lang w:val="es-ES"/>
-        </w:rPr>
-        <w:t>.: “5”</w:t>
+        <w:t>monitored_queues</w:t>
+      </w:r>
+      <w:proofErr w:type="spellEnd"/>
+      <w:r>
+        <w:rPr>
+          <w:lang w:val="es-ES"/>
+        </w:rPr>
+        <w:t xml:space="preserve">: lista de las colas que queremos monitorizar, separadas por comas, sin espacios; por ejemplo: </w:t>
+      </w:r>
+      <w:r>
+        <w:rPr>
+          <w:lang w:val="es-ES"/>
+        </w:rPr>
+        <w:t>DemoQueue,DemoQueue2</w:t>
+      </w:r>
+      <w:r>
+        <w:rPr>
+          <w:lang w:val="es-ES"/>
+        </w:rPr>
+        <w:t>.</w:t>
       </w:r>
     </w:p>
     <w:p>
@@ -6295,6 +7082,52 @@
         <w:rPr>
           <w:lang w:val="es-ES"/>
         </w:rPr>
+        <w:t>monitoring_freq_in_minutes</w:t>
+      </w:r>
+      <w:proofErr w:type="spellEnd"/>
+      <w:r>
+        <w:rPr>
+          <w:lang w:val="es-ES"/>
+        </w:rPr>
+        <w:t>: minutos que han de</w:t>
+      </w:r>
+      <w:r>
+        <w:rPr>
+          <w:lang w:val="es-ES"/>
+        </w:rPr>
+        <w:t xml:space="preserve"> pasar entre comprobaciones. Número entero entre comillas dobles, </w:t>
+      </w:r>
+      <w:proofErr w:type="spellStart"/>
+      <w:r>
+        <w:rPr>
+          <w:lang w:val="es-ES"/>
+        </w:rPr>
+        <w:t>p.e</w:t>
+      </w:r>
+      <w:proofErr w:type="spellEnd"/>
+      <w:r>
+        <w:rPr>
+          <w:lang w:val="es-ES"/>
+        </w:rPr>
+        <w:t>.: “5”</w:t>
+      </w:r>
+    </w:p>
+    <w:p>
+      <w:pPr>
+        <w:pStyle w:val="Prrafodelista"/>
+        <w:numPr>
+          <w:ilvl w:val="0"/>
+          <w:numId w:val="10"/>
+        </w:numPr>
+        <w:rPr>
+          <w:lang w:val="es-ES"/>
+        </w:rPr>
+      </w:pPr>
+      <w:proofErr w:type="spellStart"/>
+      <w:r>
+        <w:rPr>
+          <w:lang w:val="es-ES"/>
+        </w:rPr>
         <w:t>monitoring_wait_in_seconds</w:t>
       </w:r>
       <w:proofErr w:type="spellEnd"/>
@@ -6335,21 +7168,7 @@
         <w:rPr>
           <w:lang w:val="es-ES"/>
         </w:rPr>
-        <w:t xml:space="preserve">El resto de </w:t>
-      </w:r>
-      <w:proofErr w:type="gramStart"/>
-      <w:r>
-        <w:rPr>
-          <w:lang w:val="es-ES"/>
-        </w:rPr>
-        <w:t>parámetros</w:t>
-      </w:r>
-      <w:proofErr w:type="gramEnd"/>
-      <w:r>
-        <w:rPr>
-          <w:lang w:val="es-ES"/>
-        </w:rPr>
-        <w:t xml:space="preserve"> son opcionales y su significado se puede consultar en la especificación de la aplicación.</w:t>
+        <w:t>El resto de parámetros son opcionales y su significado se puede consultar en la especificación de la aplicación.</w:t>
       </w:r>
       <w:r>
         <w:rPr>
@@ -6365,12 +7184,16 @@
           <w:lang w:val="es-ES"/>
         </w:rPr>
       </w:pPr>
+      <w:bookmarkStart w:id="16" w:name="_Toc244246156"/>
+      <w:bookmarkStart w:id="17" w:name="_Despliegue_al_entorno"/>
+      <w:bookmarkEnd w:id="17"/>
       <w:r>
         <w:rPr>
           <w:lang w:val="es-ES"/>
         </w:rPr>
         <w:t>Despliegue al entorno Cloud Foundry</w:t>
       </w:r>
+      <w:bookmarkEnd w:id="16"/>
     </w:p>
     <w:p>
       <w:pPr>
@@ -6412,7 +7235,7 @@
                     </pic:cNvPicPr>
                   </pic:nvPicPr>
                   <pic:blipFill>
-                    <a:blip r:embed="rId26" cstate="print">
+                    <a:blip r:embed="rId27" cstate="print">
                       <a:extLst>
                         <a:ext uri="{28A0092B-C50C-407E-A947-70E740481C1C}">
                           <a14:useLocalDpi xmlns:a14="http://schemas.microsoft.com/office/drawing/2010/main" val="0"/>
@@ -6483,7 +7306,7 @@
                     </pic:cNvPicPr>
                   </pic:nvPicPr>
                   <pic:blipFill>
-                    <a:blip r:embed="rId27" cstate="print">
+                    <a:blip r:embed="rId28" cstate="print">
                       <a:extLst>
                         <a:ext uri="{28A0092B-C50C-407E-A947-70E740481C1C}">
                           <a14:useLocalDpi xmlns:a14="http://schemas.microsoft.com/office/drawing/2010/main" val="0"/>
@@ -6656,8 +7479,10 @@
       </w:pPr>
       <w:r>
         <w:rPr>
-          <w:lang w:val="es-ES"/>
-        </w:rPr>
+          <w:noProof/>
+          <w:lang w:val="es-ES"/>
+        </w:rPr>
+        <w:lastRenderedPageBreak/>
         <w:drawing>
           <wp:inline distT="0" distB="0" distL="0" distR="0" wp14:anchorId="0408C2BA" wp14:editId="31C0515D">
             <wp:extent cx="5684569" cy="1883713"/>
@@ -6674,7 +7499,7 @@
                     <pic:cNvPicPr/>
                   </pic:nvPicPr>
                   <pic:blipFill>
-                    <a:blip r:embed="rId28"/>
+                    <a:blip r:embed="rId29"/>
                     <a:stretch>
                       <a:fillRect/>
                     </a:stretch>
@@ -6722,7 +7547,6 @@
         <w:rPr>
           <w:lang w:val="es-ES"/>
         </w:rPr>
-        <w:lastRenderedPageBreak/>
         <w:t xml:space="preserve">El propio comando nos pedirá elegir una organización y un espacio. Seleccionaremos aquellos que nos sean relevantes (donde queramos desplegar la aplicación; no tienen por qué coincidir con nada que hayamos hecho antes, ni donde estén las </w:t>
       </w:r>
       <w:proofErr w:type="spellStart"/>
@@ -6785,14 +7609,7 @@
           <w:rFonts w:ascii="Aptos Mono" w:hAnsi="Aptos Mono"/>
           <w:lang w:val="es-ES"/>
         </w:rPr>
-        <w:t xml:space="preserve">cd </w:t>
-      </w:r>
-      <w:r>
-        <w:rPr>
-          <w:rFonts w:ascii="Aptos Mono" w:hAnsi="Aptos Mono"/>
-          <w:lang w:val="es-ES"/>
-        </w:rPr>
-        <w:t>C:\Users\ManuelAlmagro\Desktop\AvvalePipelineMonitoring</w:t>
+        <w:t>cd C:\Users\ManuelAlmagro\Desktop\AvvalePipelineMonitoring</w:t>
       </w:r>
     </w:p>
     <w:p>
@@ -6826,8 +7643,49 @@
           <w:rFonts w:ascii="Aptos Mono" w:hAnsi="Aptos Mono"/>
           <w:lang w:val="es-ES"/>
         </w:rPr>
-        <w:t xml:space="preserve"> push --vars-file vars.yml</w:t>
-      </w:r>
+        <w:t xml:space="preserve"> </w:t>
+      </w:r>
+      <w:proofErr w:type="spellStart"/>
+      <w:r>
+        <w:rPr>
+          <w:rFonts w:ascii="Aptos Mono" w:hAnsi="Aptos Mono"/>
+          <w:lang w:val="es-ES"/>
+        </w:rPr>
+        <w:t>push</w:t>
+      </w:r>
+      <w:proofErr w:type="spellEnd"/>
+      <w:r>
+        <w:rPr>
+          <w:rFonts w:ascii="Aptos Mono" w:hAnsi="Aptos Mono"/>
+          <w:lang w:val="es-ES"/>
+        </w:rPr>
+        <w:t xml:space="preserve"> --</w:t>
+      </w:r>
+      <w:proofErr w:type="spellStart"/>
+      <w:r>
+        <w:rPr>
+          <w:rFonts w:ascii="Aptos Mono" w:hAnsi="Aptos Mono"/>
+          <w:lang w:val="es-ES"/>
+        </w:rPr>
+        <w:t>vars</w:t>
+      </w:r>
+      <w:proofErr w:type="spellEnd"/>
+      <w:r>
+        <w:rPr>
+          <w:rFonts w:ascii="Aptos Mono" w:hAnsi="Aptos Mono"/>
+          <w:lang w:val="es-ES"/>
+        </w:rPr>
+        <w:t xml:space="preserve">-file </w:t>
+      </w:r>
+      <w:proofErr w:type="spellStart"/>
+      <w:r>
+        <w:rPr>
+          <w:rFonts w:ascii="Aptos Mono" w:hAnsi="Aptos Mono"/>
+          <w:lang w:val="es-ES"/>
+        </w:rPr>
+        <w:t>vars.yml</w:t>
+      </w:r>
+      <w:proofErr w:type="spellEnd"/>
     </w:p>
     <w:p>
       <w:pPr>
@@ -6855,8 +7713,10 @@
       </w:pPr>
       <w:r>
         <w:rPr>
-          <w:lang w:val="es-ES"/>
-        </w:rPr>
+          <w:noProof/>
+          <w:lang w:val="es-ES"/>
+        </w:rPr>
+        <w:lastRenderedPageBreak/>
         <w:drawing>
           <wp:inline distT="0" distB="0" distL="0" distR="0" wp14:anchorId="58F57466" wp14:editId="20AFEA74">
             <wp:extent cx="5938520" cy="2983230"/>
@@ -6873,7 +7733,7 @@
                     <pic:cNvPicPr/>
                   </pic:nvPicPr>
                   <pic:blipFill>
-                    <a:blip r:embed="rId29"/>
+                    <a:blip r:embed="rId30"/>
                     <a:stretch>
                       <a:fillRect/>
                     </a:stretch>
@@ -6927,9 +7787,9 @@
       </w:pPr>
       <w:r>
         <w:rPr>
-          <w:lang w:val="es-ES"/>
-        </w:rPr>
-        <w:lastRenderedPageBreak/>
+          <w:noProof/>
+          <w:lang w:val="es-ES"/>
+        </w:rPr>
         <w:drawing>
           <wp:inline distT="0" distB="0" distL="0" distR="0" wp14:anchorId="0F125A11" wp14:editId="0FBDF33B">
             <wp:extent cx="5938520" cy="1713230"/>
@@ -6946,7 +7806,7 @@
                     <pic:cNvPicPr/>
                   </pic:nvPicPr>
                   <pic:blipFill>
-                    <a:blip r:embed="rId30"/>
+                    <a:blip r:embed="rId31"/>
                     <a:stretch>
                       <a:fillRect/>
                     </a:stretch>
@@ -7000,8 +7860,10 @@
       </w:pPr>
       <w:r>
         <w:rPr>
-          <w:lang w:val="es-ES"/>
-        </w:rPr>
+          <w:noProof/>
+          <w:lang w:val="es-ES"/>
+        </w:rPr>
+        <w:lastRenderedPageBreak/>
         <w:drawing>
           <wp:inline distT="0" distB="0" distL="0" distR="0" wp14:anchorId="5EC871E9" wp14:editId="3A540247">
             <wp:extent cx="5938520" cy="2604770"/>
@@ -7018,7 +7880,7 @@
                     <pic:cNvPicPr/>
                   </pic:nvPicPr>
                   <pic:blipFill>
-                    <a:blip r:embed="rId31"/>
+                    <a:blip r:embed="rId32"/>
                     <a:stretch>
                       <a:fillRect/>
                     </a:stretch>
@@ -7354,7 +8216,7 @@
                     <pic:cNvPicPr preferRelativeResize="0"/>
                   </pic:nvPicPr>
                   <pic:blipFill>
-                    <a:blip r:embed="rId32"/>
+                    <a:blip r:embed="rId33"/>
                     <a:srcRect t="33" b="33"/>
                     <a:stretch>
                       <a:fillRect/>
@@ -7378,10 +8240,10 @@
       </w:r>
     </w:p>
     <w:sectPr>
-      <w:headerReference w:type="default" r:id="rId33"/>
-      <w:footerReference w:type="default" r:id="rId34"/>
-      <w:headerReference w:type="first" r:id="rId35"/>
-      <w:footerReference w:type="first" r:id="rId36"/>
+      <w:headerReference w:type="default" r:id="rId34"/>
+      <w:footerReference w:type="default" r:id="rId35"/>
+      <w:headerReference w:type="first" r:id="rId36"/>
+      <w:footerReference w:type="first" r:id="rId37"/>
       <w:pgSz w:w="11900" w:h="16820"/>
       <w:pgMar w:top="2880" w:right="1296" w:bottom="2260" w:left="1252" w:header="662" w:footer="662" w:gutter="0"/>
       <w:pgNumType w:start="1"/>
@@ -7460,15 +8322,7 @@
         <w:sz w:val="14"/>
         <w:szCs w:val="14"/>
       </w:rPr>
-      <w:t xml:space="preserve">Via Melzi D’Eril 34, 20154 Milano (MI) - </w:t>
-    </w:r>
-    <w:proofErr w:type="gramStart"/>
-    <w:r>
-      <w:rPr>
-        <w:sz w:val="14"/>
-        <w:szCs w:val="14"/>
-      </w:rPr>
-      <w:t>Italia</w:t>
+      <w:t>Via Melzi D’Eril 34, 20154 Milano (MI) - Italia</w:t>
     </w:r>
     <w:r>
       <w:rPr>
@@ -7484,15 +8338,7 @@
         <w:sz w:val="14"/>
         <w:szCs w:val="14"/>
       </w:rPr>
-      <w:t>–</w:t>
-    </w:r>
-    <w:proofErr w:type="gramEnd"/>
-    <w:r>
-      <w:rPr>
-        <w:sz w:val="14"/>
-        <w:szCs w:val="14"/>
-      </w:rPr>
-      <w:t xml:space="preserve">  T + 39 02 87311</w:t>
+      <w:t>–  T + 39 02 87311</w:t>
     </w:r>
   </w:p>
   <w:p>
@@ -7513,47 +8359,7 @@
         <w:sz w:val="14"/>
         <w:szCs w:val="14"/>
       </w:rPr>
-      <w:t xml:space="preserve">REA di Milano </w:t>
-    </w:r>
-    <w:proofErr w:type="gramStart"/>
-    <w:r>
-      <w:rPr>
-        <w:sz w:val="14"/>
-        <w:szCs w:val="14"/>
-      </w:rPr>
-      <w:t>1726950  –</w:t>
-    </w:r>
-    <w:proofErr w:type="gramEnd"/>
-    <w:r>
-      <w:rPr>
-        <w:sz w:val="14"/>
-        <w:szCs w:val="14"/>
-      </w:rPr>
-      <w:t xml:space="preserve">  C.F. e P.I. IT</w:t>
-    </w:r>
-    <w:proofErr w:type="gramStart"/>
-    <w:r>
-      <w:rPr>
-        <w:sz w:val="14"/>
-        <w:szCs w:val="14"/>
-      </w:rPr>
-      <w:t>04113150967  –</w:t>
-    </w:r>
-    <w:proofErr w:type="gramEnd"/>
-    <w:r>
-      <w:rPr>
-        <w:sz w:val="14"/>
-        <w:szCs w:val="14"/>
-      </w:rPr>
-      <w:t xml:space="preserve">  Capitale Sociale Euro 2.577.723,</w:t>
-    </w:r>
-    <w:proofErr w:type="gramStart"/>
-    <w:r>
-      <w:rPr>
-        <w:sz w:val="14"/>
-        <w:szCs w:val="14"/>
-      </w:rPr>
-      <w:t xml:space="preserve">00  </w:t>
+      <w:t xml:space="preserve">REA di Milano 1726950  –  C.F. e P.I. IT04113150967  –  Capitale Sociale Euro 2.577.723,00  </w:t>
     </w:r>
     <w:proofErr w:type="spellStart"/>
     <w:r>
@@ -7571,7 +8377,6 @@
       </w:rPr>
       <w:t>.</w:t>
     </w:r>
-    <w:proofErr w:type="gramEnd"/>
   </w:p>
   <w:p>
     <w:pPr>
@@ -9984,6 +10789,284 @@
       <w:contextualSpacing/>
     </w:pPr>
   </w:style>
+  <w:style w:type="paragraph" w:styleId="TtuloTDC">
+    <w:name w:val="TOC Heading"/>
+    <w:basedOn w:val="Ttulo1"/>
+    <w:next w:val="Normal"/>
+    <w:uiPriority w:val="39"/>
+    <w:unhideWhenUsed/>
+    <w:qFormat/>
+    <w:rsid w:val="00426CC6"/>
+    <w:pPr>
+      <w:spacing w:before="240" w:after="0" w:line="259" w:lineRule="auto"/>
+      <w:ind w:right="0"/>
+      <w:outlineLvl w:val="9"/>
+    </w:pPr>
+    <w:rPr>
+      <w:rFonts w:asciiTheme="majorHAnsi" w:eastAsiaTheme="majorEastAsia" w:hAnsiTheme="majorHAnsi" w:cstheme="majorBidi"/>
+      <w:color w:val="365F91" w:themeColor="accent1" w:themeShade="BF"/>
+      <w:sz w:val="32"/>
+      <w:szCs w:val="32"/>
+      <w:highlight w:val="none"/>
+      <w:lang w:val="es-ES"/>
+    </w:rPr>
+  </w:style>
+  <w:style w:type="paragraph" w:styleId="TDC1">
+    <w:name w:val="toc 1"/>
+    <w:basedOn w:val="Normal"/>
+    <w:next w:val="Normal"/>
+    <w:autoRedefine/>
+    <w:uiPriority w:val="39"/>
+    <w:unhideWhenUsed/>
+    <w:rsid w:val="00426CC6"/>
+    <w:pPr>
+      <w:tabs>
+        <w:tab w:val="right" w:leader="dot" w:pos="9342"/>
+      </w:tabs>
+      <w:spacing w:after="100"/>
+    </w:pPr>
+    <w:rPr>
+      <w:b/>
+      <w:bCs/>
+      <w:noProof/>
+      <w:highlight w:val="none"/>
+      <w:lang w:val="es-ES"/>
+    </w:rPr>
+  </w:style>
+  <w:style w:type="paragraph" w:styleId="TDC2">
+    <w:name w:val="toc 2"/>
+    <w:basedOn w:val="Normal"/>
+    <w:next w:val="Normal"/>
+    <w:autoRedefine/>
+    <w:uiPriority w:val="39"/>
+    <w:unhideWhenUsed/>
+    <w:rsid w:val="00426CC6"/>
+    <w:pPr>
+      <w:spacing w:after="100"/>
+      <w:ind w:left="200"/>
+    </w:pPr>
+  </w:style>
+  <w:style w:type="paragraph" w:styleId="TDC3">
+    <w:name w:val="toc 3"/>
+    <w:basedOn w:val="Normal"/>
+    <w:next w:val="Normal"/>
+    <w:autoRedefine/>
+    <w:uiPriority w:val="39"/>
+    <w:unhideWhenUsed/>
+    <w:rsid w:val="00426CC6"/>
+    <w:pPr>
+      <w:tabs>
+        <w:tab w:val="right" w:leader="dot" w:pos="9342"/>
+      </w:tabs>
+      <w:spacing w:after="100"/>
+      <w:ind w:left="400"/>
+    </w:pPr>
+    <w:rPr>
+      <w:noProof/>
+      <w:highlight w:val="none"/>
+      <w:lang w:val="es-ES"/>
+    </w:rPr>
+  </w:style>
+  <w:style w:type="table" w:styleId="Tablaconcuadrcula">
+    <w:name w:val="Table Grid"/>
+    <w:basedOn w:val="Tablanormal"/>
+    <w:uiPriority w:val="39"/>
+    <w:rsid w:val="00426CC6"/>
+    <w:pPr>
+      <w:spacing w:after="0" w:line="240" w:lineRule="auto"/>
+    </w:pPr>
+    <w:tblPr>
+      <w:tblBorders>
+        <w:top w:val="single" w:sz="4" w:space="0" w:color="auto"/>
+        <w:left w:val="single" w:sz="4" w:space="0" w:color="auto"/>
+        <w:bottom w:val="single" w:sz="4" w:space="0" w:color="auto"/>
+        <w:right w:val="single" w:sz="4" w:space="0" w:color="auto"/>
+        <w:insideH w:val="single" w:sz="4" w:space="0" w:color="auto"/>
+        <w:insideV w:val="single" w:sz="4" w:space="0" w:color="auto"/>
+      </w:tblBorders>
+    </w:tblPr>
+  </w:style>
+  <w:style w:type="table" w:styleId="Tabladelista1clara-nfasis3">
+    <w:name w:val="List Table 1 Light Accent 3"/>
+    <w:basedOn w:val="Tablanormal"/>
+    <w:uiPriority w:val="46"/>
+    <w:rsid w:val="00426CC6"/>
+    <w:pPr>
+      <w:spacing w:after="0" w:line="240" w:lineRule="auto"/>
+    </w:pPr>
+    <w:tblPr>
+      <w:tblStyleRowBandSize w:val="1"/>
+      <w:tblStyleColBandSize w:val="1"/>
+    </w:tblPr>
+    <w:tblStylePr w:type="firstRow">
+      <w:rPr>
+        <w:b/>
+        <w:bCs/>
+      </w:rPr>
+      <w:tblPr/>
+      <w:tcPr>
+        <w:tcBorders>
+          <w:bottom w:val="single" w:sz="4" w:space="0" w:color="C2D69B" w:themeColor="accent3" w:themeTint="99"/>
+        </w:tcBorders>
+      </w:tcPr>
+    </w:tblStylePr>
+    <w:tblStylePr w:type="lastRow">
+      <w:rPr>
+        <w:b/>
+        <w:bCs/>
+      </w:rPr>
+      <w:tblPr/>
+      <w:tcPr>
+        <w:tcBorders>
+          <w:top w:val="single" w:sz="4" w:space="0" w:color="C2D69B" w:themeColor="accent3" w:themeTint="99"/>
+        </w:tcBorders>
+      </w:tcPr>
+    </w:tblStylePr>
+    <w:tblStylePr w:type="firstCol">
+      <w:rPr>
+        <w:b/>
+        <w:bCs/>
+      </w:rPr>
+    </w:tblStylePr>
+    <w:tblStylePr w:type="lastCol">
+      <w:rPr>
+        <w:b/>
+        <w:bCs/>
+      </w:rPr>
+    </w:tblStylePr>
+    <w:tblStylePr w:type="band1Vert">
+      <w:tblPr/>
+      <w:tcPr>
+        <w:shd w:val="clear" w:color="auto" w:fill="EAF1DD" w:themeFill="accent3" w:themeFillTint="33"/>
+      </w:tcPr>
+    </w:tblStylePr>
+    <w:tblStylePr w:type="band1Horz">
+      <w:tblPr/>
+      <w:tcPr>
+        <w:shd w:val="clear" w:color="auto" w:fill="EAF1DD" w:themeFill="accent3" w:themeFillTint="33"/>
+      </w:tcPr>
+    </w:tblStylePr>
+  </w:style>
+  <w:style w:type="table" w:styleId="Tablaconcuadrcula4-nfasis3">
+    <w:name w:val="Grid Table 4 Accent 3"/>
+    <w:basedOn w:val="Tablanormal"/>
+    <w:uiPriority w:val="49"/>
+    <w:rsid w:val="00426CC6"/>
+    <w:pPr>
+      <w:spacing w:after="0" w:line="240" w:lineRule="auto"/>
+    </w:pPr>
+    <w:tblPr>
+      <w:tblStyleRowBandSize w:val="1"/>
+      <w:tblStyleColBandSize w:val="1"/>
+      <w:tblBorders>
+        <w:top w:val="single" w:sz="4" w:space="0" w:color="C2D69B" w:themeColor="accent3" w:themeTint="99"/>
+        <w:left w:val="single" w:sz="4" w:space="0" w:color="C2D69B" w:themeColor="accent3" w:themeTint="99"/>
+        <w:bottom w:val="single" w:sz="4" w:space="0" w:color="C2D69B" w:themeColor="accent3" w:themeTint="99"/>
+        <w:right w:val="single" w:sz="4" w:space="0" w:color="C2D69B" w:themeColor="accent3" w:themeTint="99"/>
+        <w:insideH w:val="single" w:sz="4" w:space="0" w:color="C2D69B" w:themeColor="accent3" w:themeTint="99"/>
+        <w:insideV w:val="single" w:sz="4" w:space="0" w:color="C2D69B" w:themeColor="accent3" w:themeTint="99"/>
+      </w:tblBorders>
+    </w:tblPr>
+    <w:tblStylePr w:type="firstRow">
+      <w:rPr>
+        <w:b/>
+        <w:bCs/>
+        <w:color w:val="FFFFFF" w:themeColor="background1"/>
+      </w:rPr>
+      <w:tblPr/>
+      <w:tcPr>
+        <w:tcBorders>
+          <w:top w:val="single" w:sz="4" w:space="0" w:color="9BBB59" w:themeColor="accent3"/>
+          <w:left w:val="single" w:sz="4" w:space="0" w:color="9BBB59" w:themeColor="accent3"/>
+          <w:bottom w:val="single" w:sz="4" w:space="0" w:color="9BBB59" w:themeColor="accent3"/>
+          <w:right w:val="single" w:sz="4" w:space="0" w:color="9BBB59" w:themeColor="accent3"/>
+          <w:insideH w:val="nil"/>
+          <w:insideV w:val="nil"/>
+        </w:tcBorders>
+        <w:shd w:val="clear" w:color="auto" w:fill="9BBB59" w:themeFill="accent3"/>
+      </w:tcPr>
+    </w:tblStylePr>
+    <w:tblStylePr w:type="lastRow">
+      <w:rPr>
+        <w:b/>
+        <w:bCs/>
+      </w:rPr>
+      <w:tblPr/>
+      <w:tcPr>
+        <w:tcBorders>
+          <w:top w:val="double" w:sz="4" w:space="0" w:color="9BBB59" w:themeColor="accent3"/>
+        </w:tcBorders>
+      </w:tcPr>
+    </w:tblStylePr>
+    <w:tblStylePr w:type="firstCol">
+      <w:rPr>
+        <w:b/>
+        <w:bCs/>
+      </w:rPr>
+    </w:tblStylePr>
+    <w:tblStylePr w:type="lastCol">
+      <w:rPr>
+        <w:b/>
+        <w:bCs/>
+      </w:rPr>
+    </w:tblStylePr>
+    <w:tblStylePr w:type="band1Vert">
+      <w:tblPr/>
+      <w:tcPr>
+        <w:shd w:val="clear" w:color="auto" w:fill="EAF1DD" w:themeFill="accent3" w:themeFillTint="33"/>
+      </w:tcPr>
+    </w:tblStylePr>
+    <w:tblStylePr w:type="band1Horz">
+      <w:tblPr/>
+      <w:tcPr>
+        <w:shd w:val="clear" w:color="auto" w:fill="EAF1DD" w:themeFill="accent3" w:themeFillTint="33"/>
+      </w:tcPr>
+    </w:tblStylePr>
+  </w:style>
+  <w:style w:type="paragraph" w:styleId="Encabezado">
+    <w:name w:val="header"/>
+    <w:basedOn w:val="Normal"/>
+    <w:link w:val="EncabezadoCar"/>
+    <w:uiPriority w:val="99"/>
+    <w:unhideWhenUsed/>
+    <w:rsid w:val="00426CC6"/>
+    <w:pPr>
+      <w:tabs>
+        <w:tab w:val="center" w:pos="4252"/>
+        <w:tab w:val="right" w:pos="8504"/>
+      </w:tabs>
+      <w:spacing w:after="0" w:line="240" w:lineRule="auto"/>
+    </w:pPr>
+  </w:style>
+  <w:style w:type="character" w:customStyle="1" w:styleId="EncabezadoCar">
+    <w:name w:val="Encabezado Car"/>
+    <w:basedOn w:val="Fuentedeprrafopredeter"/>
+    <w:link w:val="Encabezado"/>
+    <w:uiPriority w:val="99"/>
+    <w:rsid w:val="00426CC6"/>
+  </w:style>
+  <w:style w:type="paragraph" w:styleId="Piedepgina">
+    <w:name w:val="footer"/>
+    <w:basedOn w:val="Normal"/>
+    <w:link w:val="PiedepginaCar"/>
+    <w:uiPriority w:val="99"/>
+    <w:unhideWhenUsed/>
+    <w:rsid w:val="00426CC6"/>
+    <w:pPr>
+      <w:tabs>
+        <w:tab w:val="center" w:pos="4252"/>
+        <w:tab w:val="right" w:pos="8504"/>
+      </w:tabs>
+      <w:spacing w:after="0" w:line="240" w:lineRule="auto"/>
+    </w:pPr>
+  </w:style>
+  <w:style w:type="character" w:customStyle="1" w:styleId="PiedepginaCar">
+    <w:name w:val="Pie de página Car"/>
+    <w:basedOn w:val="Fuentedeprrafopredeter"/>
+    <w:link w:val="Piedepgina"/>
+    <w:uiPriority w:val="99"/>
+    <w:rsid w:val="00426CC6"/>
+  </w:style>
 </w:styles>
 </file>
 
@@ -10305,4 +11388,16 @@
   </a:objectDefaults>
   <a:extraClrSchemeLst/>
 </a:theme>
+</file>
+
+<file path=customXml/item1.xml><?xml version="1.0" encoding="utf-8"?>
+<b:Sources xmlns:b="http://schemas.openxmlformats.org/officeDocument/2006/bibliography" xmlns="http://schemas.openxmlformats.org/officeDocument/2006/bibliography" SelectedStyle="\APASixthEditionOfficeOnline.xsl" StyleName="APA" Version="6"/>
+</file>
+
+<file path=customXml/itemProps1.xml><?xml version="1.0" encoding="utf-8"?>
+<ds:datastoreItem xmlns:ds="http://schemas.openxmlformats.org/officeDocument/2006/customXml" ds:itemID="{FA7D794B-275E-4F9D-927F-189E34AEA200}">
+  <ds:schemaRefs>
+    <ds:schemaRef ds:uri="http://schemas.openxmlformats.org/officeDocument/2006/bibliography"/>
+  </ds:schemaRefs>
+</ds:datastoreItem>
 </file>
</xml_diff>